<commit_message>
Deploying to gh-pages from @ nlmixr2/nonmem2rx@86d66e6feb5433fa7ef75764e899e1e91169d356 🚀
</commit_message>
<xml_diff>
--- a/articles/mod-Word.docx
+++ b/articles/mod-Word.docx
@@ -2379,7 +2379,7 @@
         </w:rPr>
         <w:t xml:space="preserve">Table </w:t>
       </w:r>
-      <w:bookmarkStart w:id="fc581c7d-fd4f-464f-9139-58361e057da2" w:name="pest_table"/>
+      <w:bookmarkStart w:id="da685874-2ea8-4933-9ace-df94baa31d33" w:name="pest_table"/>
       <w:r>
         <w:rPr/>
         <w:t xml:space="preserve"/>
@@ -2400,7 +2400,7 @@
         <w:rPr/>
         <w:t xml:space="preserve"/>
       </w:r>
-      <w:bookmarkEnd w:id="fc581c7d-fd4f-464f-9139-58361e057da2"/>
+      <w:bookmarkEnd w:id="da685874-2ea8-4933-9ace-df94baa31d33"/>
       <w:r>
         <w:rPr>
           <w:rFonts/>
@@ -2496,7 +2496,7 @@
         </w:rPr>
         <w:t xml:space="preserve">Figure </w:t>
       </w:r>
-      <w:bookmarkStart w:id="5814f0ac-892c-4040-9b21-84a7cda314b3" w:name="ind_plots"/>
+      <w:bookmarkStart w:id="40503150-289b-4440-8a9f-68e414e93d99" w:name="ind_plots"/>
       <w:r>
         <w:rPr/>
         <w:t xml:space="preserve"/>
@@ -2517,7 +2517,7 @@
         <w:rPr/>
         <w:t xml:space="preserve"/>
       </w:r>
-      <w:bookmarkEnd w:id="5814f0ac-892c-4040-9b21-84a7cda314b3"/>
+      <w:bookmarkEnd w:id="40503150-289b-4440-8a9f-68e414e93d99"/>
       <w:r>
         <w:rPr>
           <w:rFonts/>
@@ -3400,7 +3400,7 @@
         </w:rPr>
         <w:t xml:space="preserve">Figure </w:t>
       </w:r>
-      <w:bookmarkStart w:id="52887920-61e6-4fbc-932a-2bdf99d8e936" w:name="dv_vs_pred_ipred"/>
+      <w:bookmarkStart w:id="176bd4c6-7e4b-4e1c-8198-35cfa2e9f7d2" w:name="dv_vs_pred_ipred"/>
       <w:r>
         <w:rPr/>
         <w:t xml:space="preserve"/>
@@ -3421,7 +3421,7 @@
         <w:rPr/>
         <w:t xml:space="preserve"/>
       </w:r>
-      <w:bookmarkEnd w:id="52887920-61e6-4fbc-932a-2bdf99d8e936"/>
+      <w:bookmarkEnd w:id="176bd4c6-7e4b-4e1c-8198-35cfa2e9f7d2"/>
       <w:r>
         <w:rPr>
           <w:rFonts/>
@@ -3509,7 +3509,7 @@
         </w:rPr>
         <w:t xml:space="preserve">Figure </w:t>
       </w:r>
-      <w:bookmarkStart w:id="15f04b98-ea3f-47c7-ad1c-9a76c96fca1c" w:name="prm_vs_iteration"/>
+      <w:bookmarkStart w:id="828aa0b9-e127-4cf0-ad76-217c13cef723" w:name="prm_vs_iteration"/>
       <w:r>
         <w:rPr/>
         <w:t xml:space="preserve"/>
@@ -3530,7 +3530,7 @@
         <w:rPr/>
         <w:t xml:space="preserve"/>
       </w:r>
-      <w:bookmarkEnd w:id="15f04b98-ea3f-47c7-ad1c-9a76c96fca1c"/>
+      <w:bookmarkEnd w:id="828aa0b9-e127-4cf0-ad76-217c13cef723"/>
       <w:r>
         <w:rPr>
           <w:rFonts/>

</xml_diff>

<commit_message>
Deploying to gh-pages from @ nlmixr2/nonmem2rx@342c6e748f8d7e5e2bc0092f0ea02a6b0d0b5540 🚀
</commit_message>
<xml_diff>
--- a/articles/mod-Word.docx
+++ b/articles/mod-Word.docx
@@ -2379,7 +2379,7 @@
         </w:rPr>
         <w:t xml:space="preserve">Table </w:t>
       </w:r>
-      <w:bookmarkStart w:id="da685874-2ea8-4933-9ace-df94baa31d33" w:name="pest_table"/>
+      <w:bookmarkStart w:id="8d7e3653-2f45-4504-baf1-b37ca6d31798" w:name="pest_table"/>
       <w:r>
         <w:rPr/>
         <w:t xml:space="preserve"/>
@@ -2400,7 +2400,7 @@
         <w:rPr/>
         <w:t xml:space="preserve"/>
       </w:r>
-      <w:bookmarkEnd w:id="da685874-2ea8-4933-9ace-df94baa31d33"/>
+      <w:bookmarkEnd w:id="8d7e3653-2f45-4504-baf1-b37ca6d31798"/>
       <w:r>
         <w:rPr>
           <w:rFonts/>
@@ -2496,7 +2496,7 @@
         </w:rPr>
         <w:t xml:space="preserve">Figure </w:t>
       </w:r>
-      <w:bookmarkStart w:id="40503150-289b-4440-8a9f-68e414e93d99" w:name="ind_plots"/>
+      <w:bookmarkStart w:id="3fe33ace-1e74-4ea4-9d0f-c20a44cf6cae" w:name="ind_plots"/>
       <w:r>
         <w:rPr/>
         <w:t xml:space="preserve"/>
@@ -2517,7 +2517,7 @@
         <w:rPr/>
         <w:t xml:space="preserve"/>
       </w:r>
-      <w:bookmarkEnd w:id="40503150-289b-4440-8a9f-68e414e93d99"/>
+      <w:bookmarkEnd w:id="3fe33ace-1e74-4ea4-9d0f-c20a44cf6cae"/>
       <w:r>
         <w:rPr>
           <w:rFonts/>
@@ -3400,7 +3400,7 @@
         </w:rPr>
         <w:t xml:space="preserve">Figure </w:t>
       </w:r>
-      <w:bookmarkStart w:id="176bd4c6-7e4b-4e1c-8198-35cfa2e9f7d2" w:name="dv_vs_pred_ipred"/>
+      <w:bookmarkStart w:id="1c425d79-c790-450c-a0da-173573d0f2c5" w:name="dv_vs_pred_ipred"/>
       <w:r>
         <w:rPr/>
         <w:t xml:space="preserve"/>
@@ -3421,7 +3421,7 @@
         <w:rPr/>
         <w:t xml:space="preserve"/>
       </w:r>
-      <w:bookmarkEnd w:id="176bd4c6-7e4b-4e1c-8198-35cfa2e9f7d2"/>
+      <w:bookmarkEnd w:id="1c425d79-c790-450c-a0da-173573d0f2c5"/>
       <w:r>
         <w:rPr>
           <w:rFonts/>
@@ -3509,7 +3509,7 @@
         </w:rPr>
         <w:t xml:space="preserve">Figure </w:t>
       </w:r>
-      <w:bookmarkStart w:id="828aa0b9-e127-4cf0-ad76-217c13cef723" w:name="prm_vs_iteration"/>
+      <w:bookmarkStart w:id="a81f91d3-8f08-4c94-a35a-44817572c4e7" w:name="prm_vs_iteration"/>
       <w:r>
         <w:rPr/>
         <w:t xml:space="preserve"/>
@@ -3530,7 +3530,7 @@
         <w:rPr/>
         <w:t xml:space="preserve"/>
       </w:r>
-      <w:bookmarkEnd w:id="828aa0b9-e127-4cf0-ad76-217c13cef723"/>
+      <w:bookmarkEnd w:id="a81f91d3-8f08-4c94-a35a-44817572c4e7"/>
       <w:r>
         <w:rPr>
           <w:rFonts/>

</xml_diff>

<commit_message>
Deploying to gh-pages from @ nlmixr2/nonmem2rx@589d2e61fe088137963c37a9908b2729b70ba447 🚀
</commit_message>
<xml_diff>
--- a/articles/mod-Word.docx
+++ b/articles/mod-Word.docx
@@ -2379,7 +2379,7 @@
         </w:rPr>
         <w:t xml:space="preserve">Table </w:t>
       </w:r>
-      <w:bookmarkStart w:id="8d7e3653-2f45-4504-baf1-b37ca6d31798" w:name="pest_table"/>
+      <w:bookmarkStart w:id="ecf97da0-2284-4892-872b-fd978f969821" w:name="pest_table"/>
       <w:r>
         <w:rPr/>
         <w:t xml:space="preserve"/>
@@ -2400,7 +2400,7 @@
         <w:rPr/>
         <w:t xml:space="preserve"/>
       </w:r>
-      <w:bookmarkEnd w:id="8d7e3653-2f45-4504-baf1-b37ca6d31798"/>
+      <w:bookmarkEnd w:id="ecf97da0-2284-4892-872b-fd978f969821"/>
       <w:r>
         <w:rPr>
           <w:rFonts/>
@@ -2496,7 +2496,7 @@
         </w:rPr>
         <w:t xml:space="preserve">Figure </w:t>
       </w:r>
-      <w:bookmarkStart w:id="3fe33ace-1e74-4ea4-9d0f-c20a44cf6cae" w:name="ind_plots"/>
+      <w:bookmarkStart w:id="448799cf-f696-4d6a-9d70-c369a8883242" w:name="ind_plots"/>
       <w:r>
         <w:rPr/>
         <w:t xml:space="preserve"/>
@@ -2517,7 +2517,7 @@
         <w:rPr/>
         <w:t xml:space="preserve"/>
       </w:r>
-      <w:bookmarkEnd w:id="3fe33ace-1e74-4ea4-9d0f-c20a44cf6cae"/>
+      <w:bookmarkEnd w:id="448799cf-f696-4d6a-9d70-c369a8883242"/>
       <w:r>
         <w:rPr>
           <w:rFonts/>
@@ -3400,7 +3400,7 @@
         </w:rPr>
         <w:t xml:space="preserve">Figure </w:t>
       </w:r>
-      <w:bookmarkStart w:id="1c425d79-c790-450c-a0da-173573d0f2c5" w:name="dv_vs_pred_ipred"/>
+      <w:bookmarkStart w:id="126f1a27-cbda-472a-ae91-0eb7150f5d33" w:name="dv_vs_pred_ipred"/>
       <w:r>
         <w:rPr/>
         <w:t xml:space="preserve"/>
@@ -3421,7 +3421,7 @@
         <w:rPr/>
         <w:t xml:space="preserve"/>
       </w:r>
-      <w:bookmarkEnd w:id="1c425d79-c790-450c-a0da-173573d0f2c5"/>
+      <w:bookmarkEnd w:id="126f1a27-cbda-472a-ae91-0eb7150f5d33"/>
       <w:r>
         <w:rPr>
           <w:rFonts/>
@@ -3509,7 +3509,7 @@
         </w:rPr>
         <w:t xml:space="preserve">Figure </w:t>
       </w:r>
-      <w:bookmarkStart w:id="a81f91d3-8f08-4c94-a35a-44817572c4e7" w:name="prm_vs_iteration"/>
+      <w:bookmarkStart w:id="2a8e330e-f8a1-4b97-b4a6-b1bee2588597" w:name="prm_vs_iteration"/>
       <w:r>
         <w:rPr/>
         <w:t xml:space="preserve"/>
@@ -3530,7 +3530,7 @@
         <w:rPr/>
         <w:t xml:space="preserve"/>
       </w:r>
-      <w:bookmarkEnd w:id="a81f91d3-8f08-4c94-a35a-44817572c4e7"/>
+      <w:bookmarkEnd w:id="2a8e330e-f8a1-4b97-b4a6-b1bee2588597"/>
       <w:r>
         <w:rPr>
           <w:rFonts/>

</xml_diff>

<commit_message>
Deploying to gh-pages from @ nlmixr2/nonmem2rx@a196ddaa1c232f3a9e6bbfa430a4e68e718a77e3 🚀
</commit_message>
<xml_diff>
--- a/articles/mod-Word.docx
+++ b/articles/mod-Word.docx
@@ -2379,7 +2379,7 @@
         </w:rPr>
         <w:t xml:space="preserve">Table </w:t>
       </w:r>
-      <w:bookmarkStart w:id="ecf97da0-2284-4892-872b-fd978f969821" w:name="pest_table"/>
+      <w:bookmarkStart w:id="11480ff4-19d8-4894-96df-4c157f5f763f" w:name="pest_table"/>
       <w:r>
         <w:rPr/>
         <w:t xml:space="preserve"/>
@@ -2400,7 +2400,7 @@
         <w:rPr/>
         <w:t xml:space="preserve"/>
       </w:r>
-      <w:bookmarkEnd w:id="ecf97da0-2284-4892-872b-fd978f969821"/>
+      <w:bookmarkEnd w:id="11480ff4-19d8-4894-96df-4c157f5f763f"/>
       <w:r>
         <w:rPr>
           <w:rFonts/>
@@ -2496,7 +2496,7 @@
         </w:rPr>
         <w:t xml:space="preserve">Figure </w:t>
       </w:r>
-      <w:bookmarkStart w:id="448799cf-f696-4d6a-9d70-c369a8883242" w:name="ind_plots"/>
+      <w:bookmarkStart w:id="7619f173-e5c5-469f-a680-f0e7f85af35e" w:name="ind_plots"/>
       <w:r>
         <w:rPr/>
         <w:t xml:space="preserve"/>
@@ -2517,7 +2517,7 @@
         <w:rPr/>
         <w:t xml:space="preserve"/>
       </w:r>
-      <w:bookmarkEnd w:id="448799cf-f696-4d6a-9d70-c369a8883242"/>
+      <w:bookmarkEnd w:id="7619f173-e5c5-469f-a680-f0e7f85af35e"/>
       <w:r>
         <w:rPr>
           <w:rFonts/>
@@ -3400,7 +3400,7 @@
         </w:rPr>
         <w:t xml:space="preserve">Figure </w:t>
       </w:r>
-      <w:bookmarkStart w:id="126f1a27-cbda-472a-ae91-0eb7150f5d33" w:name="dv_vs_pred_ipred"/>
+      <w:bookmarkStart w:id="d001b809-0e8b-4fec-a5b9-32ff93f0ed0e" w:name="dv_vs_pred_ipred"/>
       <w:r>
         <w:rPr/>
         <w:t xml:space="preserve"/>
@@ -3421,7 +3421,7 @@
         <w:rPr/>
         <w:t xml:space="preserve"/>
       </w:r>
-      <w:bookmarkEnd w:id="126f1a27-cbda-472a-ae91-0eb7150f5d33"/>
+      <w:bookmarkEnd w:id="d001b809-0e8b-4fec-a5b9-32ff93f0ed0e"/>
       <w:r>
         <w:rPr>
           <w:rFonts/>
@@ -3509,7 +3509,7 @@
         </w:rPr>
         <w:t xml:space="preserve">Figure </w:t>
       </w:r>
-      <w:bookmarkStart w:id="2a8e330e-f8a1-4b97-b4a6-b1bee2588597" w:name="prm_vs_iteration"/>
+      <w:bookmarkStart w:id="ce0b39b0-4100-42a9-9c03-de73ebf2d8a8" w:name="prm_vs_iteration"/>
       <w:r>
         <w:rPr/>
         <w:t xml:space="preserve"/>
@@ -3530,7 +3530,7 @@
         <w:rPr/>
         <w:t xml:space="preserve"/>
       </w:r>
-      <w:bookmarkEnd w:id="2a8e330e-f8a1-4b97-b4a6-b1bee2588597"/>
+      <w:bookmarkEnd w:id="ce0b39b0-4100-42a9-9c03-de73ebf2d8a8"/>
       <w:r>
         <w:rPr>
           <w:rFonts/>

</xml_diff>

<commit_message>
Deploying to gh-pages from @ nlmixr2/nonmem2rx@cbb97ab336c0f017c30620b88c6f7bf036b0e40a 🚀
</commit_message>
<xml_diff>
--- a/articles/mod-Word.docx
+++ b/articles/mod-Word.docx
@@ -2379,7 +2379,7 @@
         </w:rPr>
         <w:t xml:space="preserve">Table </w:t>
       </w:r>
-      <w:bookmarkStart w:id="11480ff4-19d8-4894-96df-4c157f5f763f" w:name="pest_table"/>
+      <w:bookmarkStart w:id="7c23dca1-2e7e-492b-8bef-fc803fa8fedd" w:name="pest_table"/>
       <w:r>
         <w:rPr/>
         <w:t xml:space="preserve"/>
@@ -2400,7 +2400,7 @@
         <w:rPr/>
         <w:t xml:space="preserve"/>
       </w:r>
-      <w:bookmarkEnd w:id="11480ff4-19d8-4894-96df-4c157f5f763f"/>
+      <w:bookmarkEnd w:id="7c23dca1-2e7e-492b-8bef-fc803fa8fedd"/>
       <w:r>
         <w:rPr>
           <w:rFonts/>
@@ -2496,7 +2496,7 @@
         </w:rPr>
         <w:t xml:space="preserve">Figure </w:t>
       </w:r>
-      <w:bookmarkStart w:id="7619f173-e5c5-469f-a680-f0e7f85af35e" w:name="ind_plots"/>
+      <w:bookmarkStart w:id="89e916fb-445b-4865-88ed-dafdc1c96ba5" w:name="ind_plots"/>
       <w:r>
         <w:rPr/>
         <w:t xml:space="preserve"/>
@@ -2517,7 +2517,7 @@
         <w:rPr/>
         <w:t xml:space="preserve"/>
       </w:r>
-      <w:bookmarkEnd w:id="7619f173-e5c5-469f-a680-f0e7f85af35e"/>
+      <w:bookmarkEnd w:id="89e916fb-445b-4865-88ed-dafdc1c96ba5"/>
       <w:r>
         <w:rPr>
           <w:rFonts/>
@@ -3400,7 +3400,7 @@
         </w:rPr>
         <w:t xml:space="preserve">Figure </w:t>
       </w:r>
-      <w:bookmarkStart w:id="d001b809-0e8b-4fec-a5b9-32ff93f0ed0e" w:name="dv_vs_pred_ipred"/>
+      <w:bookmarkStart w:id="07563ca2-aee6-455d-b82a-f9c18f755159" w:name="dv_vs_pred_ipred"/>
       <w:r>
         <w:rPr/>
         <w:t xml:space="preserve"/>
@@ -3421,7 +3421,7 @@
         <w:rPr/>
         <w:t xml:space="preserve"/>
       </w:r>
-      <w:bookmarkEnd w:id="d001b809-0e8b-4fec-a5b9-32ff93f0ed0e"/>
+      <w:bookmarkEnd w:id="07563ca2-aee6-455d-b82a-f9c18f755159"/>
       <w:r>
         <w:rPr>
           <w:rFonts/>
@@ -3509,7 +3509,7 @@
         </w:rPr>
         <w:t xml:space="preserve">Figure </w:t>
       </w:r>
-      <w:bookmarkStart w:id="ce0b39b0-4100-42a9-9c03-de73ebf2d8a8" w:name="prm_vs_iteration"/>
+      <w:bookmarkStart w:id="62d54e72-02bf-4d80-a7e2-ddc84d52af66" w:name="prm_vs_iteration"/>
       <w:r>
         <w:rPr/>
         <w:t xml:space="preserve"/>
@@ -3530,7 +3530,7 @@
         <w:rPr/>
         <w:t xml:space="preserve"/>
       </w:r>
-      <w:bookmarkEnd w:id="ce0b39b0-4100-42a9-9c03-de73ebf2d8a8"/>
+      <w:bookmarkEnd w:id="62d54e72-02bf-4d80-a7e2-ddc84d52af66"/>
       <w:r>
         <w:rPr>
           <w:rFonts/>

</xml_diff>

<commit_message>
Deploying to gh-pages from @ nlmixr2/nonmem2rx@d794d6d4fac9b56f1cab7d686e1ee126ecd5668c 🚀
</commit_message>
<xml_diff>
--- a/articles/mod-Word.docx
+++ b/articles/mod-Word.docx
@@ -3,6 +3,1312 @@
 <w:document xmlns:wpc="http://schemas.microsoft.com/office/word/2010/wordprocessingCanvas" xmlns:cx="http://schemas.microsoft.com/office/drawing/2014/chartex" xmlns:cx1="http://schemas.microsoft.com/office/drawing/2015/9/8/chartex" xmlns:cx2="http://schemas.microsoft.com/office/drawing/2015/10/21/chartex" xmlns:cx3="http://schemas.microsoft.com/office/drawing/2016/5/9/chartex" xmlns:cx4="http://schemas.microsoft.com/office/drawing/2016/5/10/chartex" xmlns:cx5="http://schemas.microsoft.com/office/drawing/2016/5/11/chartex" xmlns:cx6="http://schemas.microsoft.com/office/drawing/2016/5/12/chartex" xmlns:cx7="http://schemas.microsoft.com/office/drawing/2016/5/13/chartex" xmlns:cx8="http://schemas.microsoft.com/office/drawing/2016/5/14/chartex" xmlns:mc="http://schemas.openxmlformats.org/markup-compatibility/2006" xmlns:aink="http://schemas.microsoft.com/office/drawing/2016/ink" xmlns:am3d="http://schemas.microsoft.com/office/drawing/2017/model3d" xmlns:o="urn:schemas-microsoft-com:office:office" xmlns:r="http://schemas.openxmlformats.org/officeDocument/2006/relationships" xmlns:m="http://schemas.openxmlformats.org/officeDocument/2006/math" xmlns:v="urn:schemas-microsoft-com:vml" xmlns:wp14="http://schemas.microsoft.com/office/word/2010/wordprocessingDrawing" xmlns:wp="http://schemas.openxmlformats.org/drawingml/2006/wordprocessingDrawing" xmlns:w10="urn:schemas-microsoft-com:office:word" xmlns:w="http://schemas.openxmlformats.org/wordprocessingml/2006/main" xmlns:w14="http://schemas.microsoft.com/office/word/2010/wordml" xmlns:w15="http://schemas.microsoft.com/office/word/2012/wordml" xmlns:w16cex="http://schemas.microsoft.com/office/word/2018/wordml/cex" xmlns:w16cid="http://schemas.microsoft.com/office/word/2016/wordml/cid" xmlns:w16="http://schemas.microsoft.com/office/word/2018/wordml" xmlns:w16sdtdh="http://schemas.microsoft.com/office/word/2020/wordml/sdtdatahash" xmlns:w16se="http://schemas.microsoft.com/office/word/2015/wordml/symex" xmlns:wpg="http://schemas.microsoft.com/office/word/2010/wordprocessingGroup" xmlns:wpi="http://schemas.microsoft.com/office/word/2010/wordprocessingInk" xmlns:wne="http://schemas.microsoft.com/office/word/2006/wordml" xmlns:wps="http://schemas.microsoft.com/office/word/2010/wordprocessingShape" mc:Ignorable="w14 w15 w16se w16cid w16 w16cex w16sdtdh wp14">
   <w:body>
     <w:p/>
+    <w:p>
+      <w:pPr>
+        <w:pStyle w:val="Heading1"/>
+      </w:pPr>
+      <w:r>
+        <w:t xml:space="preserve">Model Structure</w:t>
+      </w:r>
+    </w:p>
+    <w:p>
+      <w:pPr>
+        <w:pStyle w:val="Normal"/>
+      </w:pPr>
+      <w:r>
+        <w:rPr/>
+        <w:drawing>
+          <wp:inline distT="0" distB="0" distL="0" distR="0">
+            <wp:extent cx="5943600" cy="5486400"/>
+            <wp:docPr id="1" name="" descr=""/>
+            <wp:cNvGraphicFramePr>
+              <a:graphicFrameLocks xmlns:a="http://schemas.openxmlformats.org/drawingml/2006/main" noChangeAspect="1"/>
+            </wp:cNvGraphicFramePr>
+            <a:graphic xmlns:a="http://schemas.openxmlformats.org/drawingml/2006/main">
+              <a:graphicData uri="http://schemas.openxmlformats.org/drawingml/2006/picture">
+                <pic:pic xmlns:pic="http://schemas.openxmlformats.org/drawingml/2006/picture">
+                  <pic:nvPicPr>
+                    <pic:cNvPr id="2" name=""/>
+                    <pic:cNvPicPr>
+                      <a:picLocks noChangeAspect="1" noChangeArrowheads="1"/>
+                    </pic:cNvPicPr>
+                  </pic:nvPicPr>
+                  <pic:blipFill>
+                    <a:blip r:embed="rId16"/>
+                    <a:stretch>
+                      <a:fillRect/>
+                    </a:stretch>
+                  </pic:blipFill>
+                  <pic:spPr bwMode="auto">
+                    <a:xfrm>
+                      <a:off x="0" y="0"/>
+                      <a:ext cx="5943600" cy="5486400"/>
+                    </a:xfrm>
+                    <a:prstGeom prst="rect">
+                      <a:avLst/>
+                    </a:prstGeom>
+                    <a:noFill/>
+                  </pic:spPr>
+                </pic:pic>
+              </a:graphicData>
+            </a:graphic>
+          </wp:inline>
+        </w:drawing>
+      </w:r>
+    </w:p>
+    <w:p>
+      <w:pPr>
+        <w:pStyle w:val="graphictitle"/>
+      </w:pPr>
+      <w:r>
+        <w:rPr>
+          <w:rFonts/>
+          <w:strike w:val="false"/>
+        </w:rPr>
+        <w:t xml:space="preserve">Figure </w:t>
+      </w:r>
+      <w:bookmarkStart w:id="affe1409-828c-40b3-8872-446565762595" w:name="model_diagram"/>
+      <w:r>
+        <w:rPr/>
+        <w:t xml:space="preserve"/>
+      </w:r>
+      <w:r>
+        <w:rPr/>
+        <w:fldChar w:fldCharType="begin" w:dirty="true"/>
+      </w:r>
+      <w:r>
+        <w:rPr/>
+        <w:instrText xml:space="preserve" w:dirty="true">SEQ Figure \* Arabic</w:instrText>
+      </w:r>
+      <w:r>
+        <w:rPr/>
+        <w:fldChar w:fldCharType="end" w:dirty="true"/>
+      </w:r>
+      <w:r>
+        <w:rPr/>
+        <w:t xml:space="preserve"/>
+      </w:r>
+      <w:bookmarkEnd w:id="affe1409-828c-40b3-8872-446565762595"/>
+      <w:r>
+        <w:rPr>
+          <w:rFonts/>
+          <w:strike w:val="false"/>
+        </w:rPr>
+        <w:t xml:space="preserve">. </w:t>
+      </w:r>
+      <w:r>
+        <w:rPr>
+          <w:rFonts/>
+          <w:strike w:val="false"/>
+        </w:rPr>
+        <w:t xml:space="preserve">Model structure</w:t>
+      </w:r>
+    </w:p>
+    <w:p>
+      <w:pPr/>
+      <w:r>
+        <w:br w:type="page"/>
+      </w:r>
+    </w:p>
+    <w:tbl xmlns:a="http://schemas.openxmlformats.org/drawingml/2006/main" xmlns:pic="http://schemas.openxmlformats.org/drawingml/2006/picture">
+      <w:tblPr>
+        <w:tblLayout w:type="fixed"/>
+        <w:jc w:val="center"/>
+        <w:tblLook w:firstRow="1" w:lastRow="0" w:firstColumn="0" w:lastColumn="0" w:noHBand="0" w:noVBand="1"/>
+      </w:tblPr>
+      <w:tblGrid>
+        <w:gridCol w:w="8640"/>
+      </w:tblGrid>
+      <w:tr>
+        <w:trPr>
+          <w:trHeight w:val="360" w:hRule="auto"/>
+        </w:trPr>
+        <w:tc>
+          <w:tcPr>
+            <w:tcBorders>
+              <w:bottom w:val="none" w:sz="0" w:space="0" w:color="000000"/>
+              <w:top w:val="none" w:sz="0" w:space="0" w:color="000000"/>
+              <w:left w:val="none" w:sz="0" w:space="0" w:color="000000"/>
+              <w:right w:val="none" w:sz="0" w:space="0" w:color="000000"/>
+            </w:tcBorders>
+            <w:shd w:val="clear" w:color="auto" w:fill="FFFFFF"/>
+            <w:tcMar>
+              <w:top w:w="0" w:type="dxa"/>
+              <w:bottom w:w="0" w:type="dxa"/>
+              <w:left w:w="0" w:type="dxa"/>
+              <w:right w:w="0" w:type="dxa"/>
+            </w:tcMar>
+            <w:vAlign w:val="center"/>
+          </w:tcPr>
+          <w:p>
+            <w:pPr>
+              <w:pStyle w:val="Normal"/>
+              <w:jc w:val="left"/>
+              <w:pBdr>
+                <w:bottom w:val="none" w:sz="0" w:space="0" w:color="000000"/>
+                <w:top w:val="none" w:sz="0" w:space="0" w:color="000000"/>
+                <w:left w:val="none" w:sz="0" w:space="0" w:color="000000"/>
+                <w:right w:val="none" w:sz="0" w:space="0" w:color="000000"/>
+              </w:pBdr>
+              <w:spacing w:after="100" w:before="100" w:line="480"/>
+              <w:ind w:left="100" w:right="100" w:firstLine="0" w:firstLineChars="0"/>
+              <w:rPr>
+                <w:rFonts w:ascii="DejaVu Sans" w:hAnsi="DejaVu Sans" w:eastAsia="DejaVu Sans" w:cs="DejaVu Sans"/>
+                <w:i w:val="false"/>
+                <w:b w:val="false"/>
+                <w:u w:val="none"/>
+                <w:strike w:val="false"/>
+                <w:sz w:val="22"/>
+                <w:szCs w:val="22"/>
+                <w:color w:val="000000"/>
+              </w:rPr>
+            </w:pPr>
+            <m:oMath xmlns:mml="http://www.w3.org/1998/Math/MathML">
+              <m:r>
+                <m:t>cmt(</m:t>
+              </m:r>
+              <m:r>
+                <m:t>CENTRAL</m:t>
+              </m:r>
+              <m:r>
+                <m:t>)</m:t>
+              </m:r>
+            </m:oMath>
+          </w:p>
+        </w:tc>
+      </w:tr>
+      <w:tr>
+        <w:trPr>
+          <w:trHeight w:val="360" w:hRule="auto"/>
+        </w:trPr>
+        <w:tc>
+          <w:tcPr>
+            <w:tcBorders>
+              <w:bottom w:val="none" w:sz="0" w:space="0" w:color="000000"/>
+              <w:top w:val="none" w:sz="0" w:space="0" w:color="000000"/>
+              <w:left w:val="none" w:sz="0" w:space="0" w:color="000000"/>
+              <w:right w:val="none" w:sz="0" w:space="0" w:color="000000"/>
+            </w:tcBorders>
+            <w:shd w:val="clear" w:color="auto" w:fill="FFFFFF"/>
+            <w:tcMar>
+              <w:top w:w="0" w:type="dxa"/>
+              <w:bottom w:w="0" w:type="dxa"/>
+              <w:left w:w="0" w:type="dxa"/>
+              <w:right w:w="0" w:type="dxa"/>
+            </w:tcMar>
+            <w:vAlign w:val="center"/>
+          </w:tcPr>
+          <w:p>
+            <w:pPr>
+              <w:pStyle w:val="Normal"/>
+              <w:jc w:val="left"/>
+              <w:pBdr>
+                <w:bottom w:val="none" w:sz="0" w:space="0" w:color="000000"/>
+                <w:top w:val="none" w:sz="0" w:space="0" w:color="000000"/>
+                <w:left w:val="none" w:sz="0" w:space="0" w:color="000000"/>
+                <w:right w:val="none" w:sz="0" w:space="0" w:color="000000"/>
+              </w:pBdr>
+              <w:spacing w:after="100" w:before="100" w:line="480"/>
+              <w:ind w:left="100" w:right="100" w:firstLine="0" w:firstLineChars="0"/>
+              <w:rPr>
+                <w:rFonts w:ascii="DejaVu Sans" w:hAnsi="DejaVu Sans" w:eastAsia="DejaVu Sans" w:cs="DejaVu Sans"/>
+                <w:i w:val="false"/>
+                <w:b w:val="false"/>
+                <w:u w:val="none"/>
+                <w:strike w:val="false"/>
+                <w:sz w:val="22"/>
+                <w:szCs w:val="22"/>
+                <w:color w:val="000000"/>
+              </w:rPr>
+            </w:pPr>
+            <m:oMath xmlns:mml="http://www.w3.org/1998/Math/MathML">
+              <m:r>
+                <m:t>cmt(</m:t>
+              </m:r>
+              <m:r>
+                <m:t>PERI</m:t>
+              </m:r>
+              <m:r>
+                <m:t>)</m:t>
+              </m:r>
+            </m:oMath>
+          </w:p>
+        </w:tc>
+      </w:tr>
+      <w:tr>
+        <w:trPr>
+          <w:trHeight w:val="360" w:hRule="auto"/>
+        </w:trPr>
+        <w:tc>
+          <w:tcPr>
+            <w:tcBorders>
+              <w:bottom w:val="none" w:sz="0" w:space="0" w:color="000000"/>
+              <w:top w:val="none" w:sz="0" w:space="0" w:color="000000"/>
+              <w:left w:val="none" w:sz="0" w:space="0" w:color="000000"/>
+              <w:right w:val="none" w:sz="0" w:space="0" w:color="000000"/>
+            </w:tcBorders>
+            <w:shd w:val="clear" w:color="auto" w:fill="FFFFFF"/>
+            <w:tcMar>
+              <w:top w:w="0" w:type="dxa"/>
+              <w:bottom w:w="0" w:type="dxa"/>
+              <w:left w:w="0" w:type="dxa"/>
+              <w:right w:w="0" w:type="dxa"/>
+            </w:tcMar>
+            <w:vAlign w:val="center"/>
+          </w:tcPr>
+          <w:p>
+            <w:pPr>
+              <w:pStyle w:val="Normal"/>
+              <w:jc w:val="left"/>
+              <w:pBdr>
+                <w:bottom w:val="none" w:sz="0" w:space="0" w:color="000000"/>
+                <w:top w:val="none" w:sz="0" w:space="0" w:color="000000"/>
+                <w:left w:val="none" w:sz="0" w:space="0" w:color="000000"/>
+                <w:right w:val="none" w:sz="0" w:space="0" w:color="000000"/>
+              </w:pBdr>
+              <w:spacing w:after="100" w:before="100" w:line="480"/>
+              <w:ind w:left="100" w:right="100" w:firstLine="0" w:firstLineChars="0"/>
+              <w:rPr>
+                <w:rFonts w:ascii="DejaVu Sans" w:hAnsi="DejaVu Sans" w:eastAsia="DejaVu Sans" w:cs="DejaVu Sans"/>
+                <w:i w:val="false"/>
+                <w:b w:val="false"/>
+                <w:u w:val="none"/>
+                <w:strike w:val="false"/>
+                <w:sz w:val="22"/>
+                <w:szCs w:val="22"/>
+                <w:color w:val="000000"/>
+              </w:rPr>
+            </w:pPr>
+            <m:oMath xmlns:mml="http://www.w3.org/1998/Math/MathML">
+              <m:r>
+                <m:t>cl</m:t>
+              </m:r>
+              <m:r>
+                <m:t>=</m:t>
+              </m:r>
+              <m:r>
+                <m:rPr>
+                  <m:sty m:val="p"/>
+                </m:rPr>
+                <m:t>exp</m:t>
+              </m:r>
+              <m:r>
+                <m:t>⁡</m:t>
+              </m:r>
+              <m:r>
+                <m:t>(</m:t>
+              </m:r>
+              <m:r>
+                <m:t>theta1</m:t>
+              </m:r>
+              <m:r>
+                <m:t>+</m:t>
+              </m:r>
+              <m:r>
+                <m:t>eta1</m:t>
+              </m:r>
+              <m:r>
+                <m:t>)</m:t>
+              </m:r>
+            </m:oMath>
+          </w:p>
+        </w:tc>
+      </w:tr>
+      <w:tr>
+        <w:trPr>
+          <w:trHeight w:val="360" w:hRule="auto"/>
+        </w:trPr>
+        <w:tc>
+          <w:tcPr>
+            <w:tcBorders>
+              <w:bottom w:val="none" w:sz="0" w:space="0" w:color="000000"/>
+              <w:top w:val="none" w:sz="0" w:space="0" w:color="000000"/>
+              <w:left w:val="none" w:sz="0" w:space="0" w:color="000000"/>
+              <w:right w:val="none" w:sz="0" w:space="0" w:color="000000"/>
+            </w:tcBorders>
+            <w:shd w:val="clear" w:color="auto" w:fill="FFFFFF"/>
+            <w:tcMar>
+              <w:top w:w="0" w:type="dxa"/>
+              <w:bottom w:w="0" w:type="dxa"/>
+              <w:left w:w="0" w:type="dxa"/>
+              <w:right w:w="0" w:type="dxa"/>
+            </w:tcMar>
+            <w:vAlign w:val="center"/>
+          </w:tcPr>
+          <w:p>
+            <w:pPr>
+              <w:pStyle w:val="Normal"/>
+              <w:jc w:val="left"/>
+              <w:pBdr>
+                <w:bottom w:val="none" w:sz="0" w:space="0" w:color="000000"/>
+                <w:top w:val="none" w:sz="0" w:space="0" w:color="000000"/>
+                <w:left w:val="none" w:sz="0" w:space="0" w:color="000000"/>
+                <w:right w:val="none" w:sz="0" w:space="0" w:color="000000"/>
+              </w:pBdr>
+              <w:spacing w:after="100" w:before="100" w:line="480"/>
+              <w:ind w:left="100" w:right="100" w:firstLine="0" w:firstLineChars="0"/>
+              <w:rPr>
+                <w:rFonts w:ascii="DejaVu Sans" w:hAnsi="DejaVu Sans" w:eastAsia="DejaVu Sans" w:cs="DejaVu Sans"/>
+                <w:i w:val="false"/>
+                <w:b w:val="false"/>
+                <w:u w:val="none"/>
+                <w:strike w:val="false"/>
+                <w:sz w:val="22"/>
+                <w:szCs w:val="22"/>
+                <w:color w:val="000000"/>
+              </w:rPr>
+            </w:pPr>
+            <m:oMath xmlns:mml="http://www.w3.org/1998/Math/MathML">
+              <m:r>
+                <m:t>v=</m:t>
+              </m:r>
+              <m:r>
+                <m:rPr>
+                  <m:sty m:val="p"/>
+                </m:rPr>
+                <m:t>exp</m:t>
+              </m:r>
+              <m:r>
+                <m:t>⁡</m:t>
+              </m:r>
+              <m:r>
+                <m:t>(</m:t>
+              </m:r>
+              <m:r>
+                <m:t>theta2</m:t>
+              </m:r>
+              <m:r>
+                <m:t>+</m:t>
+              </m:r>
+              <m:r>
+                <m:t>eta2</m:t>
+              </m:r>
+              <m:r>
+                <m:t>)</m:t>
+              </m:r>
+            </m:oMath>
+          </w:p>
+        </w:tc>
+      </w:tr>
+      <w:tr>
+        <w:trPr>
+          <w:trHeight w:val="360" w:hRule="auto"/>
+        </w:trPr>
+        <w:tc>
+          <w:tcPr>
+            <w:tcBorders>
+              <w:bottom w:val="none" w:sz="0" w:space="0" w:color="000000"/>
+              <w:top w:val="none" w:sz="0" w:space="0" w:color="000000"/>
+              <w:left w:val="none" w:sz="0" w:space="0" w:color="000000"/>
+              <w:right w:val="none" w:sz="0" w:space="0" w:color="000000"/>
+            </w:tcBorders>
+            <w:shd w:val="clear" w:color="auto" w:fill="FFFFFF"/>
+            <w:tcMar>
+              <w:top w:w="0" w:type="dxa"/>
+              <w:bottom w:w="0" w:type="dxa"/>
+              <w:left w:w="0" w:type="dxa"/>
+              <w:right w:w="0" w:type="dxa"/>
+            </w:tcMar>
+            <w:vAlign w:val="center"/>
+          </w:tcPr>
+          <w:p>
+            <w:pPr>
+              <w:pStyle w:val="Normal"/>
+              <w:jc w:val="left"/>
+              <w:pBdr>
+                <w:bottom w:val="none" w:sz="0" w:space="0" w:color="000000"/>
+                <w:top w:val="none" w:sz="0" w:space="0" w:color="000000"/>
+                <w:left w:val="none" w:sz="0" w:space="0" w:color="000000"/>
+                <w:right w:val="none" w:sz="0" w:space="0" w:color="000000"/>
+              </w:pBdr>
+              <w:spacing w:after="100" w:before="100" w:line="480"/>
+              <w:ind w:left="100" w:right="100" w:firstLine="0" w:firstLineChars="0"/>
+              <w:rPr>
+                <w:rFonts w:ascii="DejaVu Sans" w:hAnsi="DejaVu Sans" w:eastAsia="DejaVu Sans" w:cs="DejaVu Sans"/>
+                <w:i w:val="false"/>
+                <w:b w:val="false"/>
+                <w:u w:val="none"/>
+                <w:strike w:val="false"/>
+                <w:sz w:val="22"/>
+                <w:szCs w:val="22"/>
+                <w:color w:val="000000"/>
+              </w:rPr>
+            </w:pPr>
+            <m:oMath xmlns:mml="http://www.w3.org/1998/Math/MathML">
+              <m:r>
+                <m:t>q=</m:t>
+              </m:r>
+              <m:r>
+                <m:rPr>
+                  <m:sty m:val="p"/>
+                </m:rPr>
+                <m:t>exp</m:t>
+              </m:r>
+              <m:r>
+                <m:t>⁡</m:t>
+              </m:r>
+              <m:r>
+                <m:t>(</m:t>
+              </m:r>
+              <m:r>
+                <m:t>theta3</m:t>
+              </m:r>
+              <m:r>
+                <m:t>+</m:t>
+              </m:r>
+              <m:r>
+                <m:t>eta3</m:t>
+              </m:r>
+              <m:r>
+                <m:t>)</m:t>
+              </m:r>
+            </m:oMath>
+          </w:p>
+        </w:tc>
+      </w:tr>
+      <w:tr>
+        <w:trPr>
+          <w:trHeight w:val="360" w:hRule="auto"/>
+        </w:trPr>
+        <w:tc>
+          <w:tcPr>
+            <w:tcBorders>
+              <w:bottom w:val="none" w:sz="0" w:space="0" w:color="000000"/>
+              <w:top w:val="none" w:sz="0" w:space="0" w:color="000000"/>
+              <w:left w:val="none" w:sz="0" w:space="0" w:color="000000"/>
+              <w:right w:val="none" w:sz="0" w:space="0" w:color="000000"/>
+            </w:tcBorders>
+            <w:shd w:val="clear" w:color="auto" w:fill="FFFFFF"/>
+            <w:tcMar>
+              <w:top w:w="0" w:type="dxa"/>
+              <w:bottom w:w="0" w:type="dxa"/>
+              <w:left w:w="0" w:type="dxa"/>
+              <w:right w:w="0" w:type="dxa"/>
+            </w:tcMar>
+            <w:vAlign w:val="center"/>
+          </w:tcPr>
+          <w:p>
+            <w:pPr>
+              <w:pStyle w:val="Normal"/>
+              <w:jc w:val="left"/>
+              <w:pBdr>
+                <w:bottom w:val="none" w:sz="0" w:space="0" w:color="000000"/>
+                <w:top w:val="none" w:sz="0" w:space="0" w:color="000000"/>
+                <w:left w:val="none" w:sz="0" w:space="0" w:color="000000"/>
+                <w:right w:val="none" w:sz="0" w:space="0" w:color="000000"/>
+              </w:pBdr>
+              <w:spacing w:after="100" w:before="100" w:line="480"/>
+              <w:ind w:left="100" w:right="100" w:firstLine="0" w:firstLineChars="0"/>
+              <w:rPr>
+                <w:rFonts w:ascii="DejaVu Sans" w:hAnsi="DejaVu Sans" w:eastAsia="DejaVu Sans" w:cs="DejaVu Sans"/>
+                <w:i w:val="false"/>
+                <w:b w:val="false"/>
+                <w:u w:val="none"/>
+                <w:strike w:val="false"/>
+                <w:sz w:val="22"/>
+                <w:szCs w:val="22"/>
+                <w:color w:val="000000"/>
+              </w:rPr>
+            </w:pPr>
+            <m:oMath xmlns:mml="http://www.w3.org/1998/Math/MathML">
+              <m:r>
+                <m:t>v2</m:t>
+              </m:r>
+              <m:r>
+                <m:t>=</m:t>
+              </m:r>
+              <m:r>
+                <m:rPr>
+                  <m:sty m:val="p"/>
+                </m:rPr>
+                <m:t>exp</m:t>
+              </m:r>
+              <m:r>
+                <m:t>⁡</m:t>
+              </m:r>
+              <m:r>
+                <m:t>(</m:t>
+              </m:r>
+              <m:r>
+                <m:t>theta4</m:t>
+              </m:r>
+              <m:r>
+                <m:t>+</m:t>
+              </m:r>
+              <m:r>
+                <m:t>eta4</m:t>
+              </m:r>
+              <m:r>
+                <m:t>)</m:t>
+              </m:r>
+            </m:oMath>
+          </w:p>
+        </w:tc>
+      </w:tr>
+      <w:tr>
+        <w:trPr>
+          <w:trHeight w:val="360" w:hRule="auto"/>
+        </w:trPr>
+        <w:tc>
+          <w:tcPr>
+            <w:tcBorders>
+              <w:bottom w:val="none" w:sz="0" w:space="0" w:color="000000"/>
+              <w:top w:val="none" w:sz="0" w:space="0" w:color="000000"/>
+              <w:left w:val="none" w:sz="0" w:space="0" w:color="000000"/>
+              <w:right w:val="none" w:sz="0" w:space="0" w:color="000000"/>
+            </w:tcBorders>
+            <w:shd w:val="clear" w:color="auto" w:fill="FFFFFF"/>
+            <w:tcMar>
+              <w:top w:w="0" w:type="dxa"/>
+              <w:bottom w:w="0" w:type="dxa"/>
+              <w:left w:w="0" w:type="dxa"/>
+              <w:right w:w="0" w:type="dxa"/>
+            </w:tcMar>
+            <w:vAlign w:val="center"/>
+          </w:tcPr>
+          <w:p>
+            <w:pPr>
+              <w:pStyle w:val="Normal"/>
+              <w:jc w:val="left"/>
+              <w:pBdr>
+                <w:bottom w:val="none" w:sz="0" w:space="0" w:color="000000"/>
+                <w:top w:val="none" w:sz="0" w:space="0" w:color="000000"/>
+                <w:left w:val="none" w:sz="0" w:space="0" w:color="000000"/>
+                <w:right w:val="none" w:sz="0" w:space="0" w:color="000000"/>
+              </w:pBdr>
+              <w:spacing w:after="100" w:before="100" w:line="480"/>
+              <w:ind w:left="100" w:right="100" w:firstLine="0" w:firstLineChars="0"/>
+              <w:rPr>
+                <w:rFonts w:ascii="DejaVu Sans" w:hAnsi="DejaVu Sans" w:eastAsia="DejaVu Sans" w:cs="DejaVu Sans"/>
+                <w:i w:val="false"/>
+                <w:b w:val="false"/>
+                <w:u w:val="none"/>
+                <w:strike w:val="false"/>
+                <w:sz w:val="22"/>
+                <w:szCs w:val="22"/>
+                <w:color w:val="000000"/>
+              </w:rPr>
+            </w:pPr>
+            <m:oMath xmlns:mml="http://www.w3.org/1998/Math/MathML">
+              <m:r>
+                <m:t>v1</m:t>
+              </m:r>
+              <m:r>
+                <m:t>=v</m:t>
+              </m:r>
+            </m:oMath>
+          </w:p>
+        </w:tc>
+      </w:tr>
+      <w:tr>
+        <w:trPr>
+          <w:trHeight w:val="360" w:hRule="auto"/>
+        </w:trPr>
+        <w:tc>
+          <w:tcPr>
+            <w:tcBorders>
+              <w:bottom w:val="none" w:sz="0" w:space="0" w:color="000000"/>
+              <w:top w:val="none" w:sz="0" w:space="0" w:color="000000"/>
+              <w:left w:val="none" w:sz="0" w:space="0" w:color="000000"/>
+              <w:right w:val="none" w:sz="0" w:space="0" w:color="000000"/>
+            </w:tcBorders>
+            <w:shd w:val="clear" w:color="auto" w:fill="FFFFFF"/>
+            <w:tcMar>
+              <w:top w:w="0" w:type="dxa"/>
+              <w:bottom w:w="0" w:type="dxa"/>
+              <w:left w:w="0" w:type="dxa"/>
+              <w:right w:w="0" w:type="dxa"/>
+            </w:tcMar>
+            <w:vAlign w:val="center"/>
+          </w:tcPr>
+          <w:p>
+            <w:pPr>
+              <w:pStyle w:val="Normal"/>
+              <w:jc w:val="left"/>
+              <w:pBdr>
+                <w:bottom w:val="none" w:sz="0" w:space="0" w:color="000000"/>
+                <w:top w:val="none" w:sz="0" w:space="0" w:color="000000"/>
+                <w:left w:val="none" w:sz="0" w:space="0" w:color="000000"/>
+                <w:right w:val="none" w:sz="0" w:space="0" w:color="000000"/>
+              </w:pBdr>
+              <w:spacing w:after="100" w:before="100" w:line="480"/>
+              <w:ind w:left="100" w:right="100" w:firstLine="0" w:firstLineChars="0"/>
+              <w:rPr>
+                <w:rFonts w:ascii="DejaVu Sans" w:hAnsi="DejaVu Sans" w:eastAsia="DejaVu Sans" w:cs="DejaVu Sans"/>
+                <w:i w:val="false"/>
+                <w:b w:val="false"/>
+                <w:u w:val="none"/>
+                <w:strike w:val="false"/>
+                <w:sz w:val="22"/>
+                <w:szCs w:val="22"/>
+                <w:color w:val="000000"/>
+              </w:rPr>
+            </w:pPr>
+            <m:oMath xmlns:mml="http://www.w3.org/1998/Math/MathML">
+              <m:r>
+                <m:t>scale1</m:t>
+              </m:r>
+              <m:r>
+                <m:t>=v</m:t>
+              </m:r>
+            </m:oMath>
+          </w:p>
+        </w:tc>
+      </w:tr>
+      <w:tr>
+        <w:trPr>
+          <w:trHeight w:val="360" w:hRule="auto"/>
+        </w:trPr>
+        <w:tc>
+          <w:tcPr>
+            <w:tcBorders>
+              <w:bottom w:val="none" w:sz="0" w:space="0" w:color="000000"/>
+              <w:top w:val="none" w:sz="0" w:space="0" w:color="000000"/>
+              <w:left w:val="none" w:sz="0" w:space="0" w:color="000000"/>
+              <w:right w:val="none" w:sz="0" w:space="0" w:color="000000"/>
+            </w:tcBorders>
+            <w:shd w:val="clear" w:color="auto" w:fill="FFFFFF"/>
+            <w:tcMar>
+              <w:top w:w="0" w:type="dxa"/>
+              <w:bottom w:w="0" w:type="dxa"/>
+              <w:left w:w="0" w:type="dxa"/>
+              <w:right w:w="0" w:type="dxa"/>
+            </w:tcMar>
+            <w:vAlign w:val="center"/>
+          </w:tcPr>
+          <w:p>
+            <w:pPr>
+              <w:pStyle w:val="Normal"/>
+              <w:jc w:val="left"/>
+              <w:pBdr>
+                <w:bottom w:val="none" w:sz="0" w:space="0" w:color="000000"/>
+                <w:top w:val="none" w:sz="0" w:space="0" w:color="000000"/>
+                <w:left w:val="none" w:sz="0" w:space="0" w:color="000000"/>
+                <w:right w:val="none" w:sz="0" w:space="0" w:color="000000"/>
+              </w:pBdr>
+              <w:spacing w:after="100" w:before="100" w:line="480"/>
+              <w:ind w:left="100" w:right="100" w:firstLine="0" w:firstLineChars="0"/>
+              <w:rPr>
+                <w:rFonts w:ascii="DejaVu Sans" w:hAnsi="DejaVu Sans" w:eastAsia="DejaVu Sans" w:cs="DejaVu Sans"/>
+                <w:i w:val="false"/>
+                <w:b w:val="false"/>
+                <w:u w:val="none"/>
+                <w:strike w:val="false"/>
+                <w:sz w:val="22"/>
+                <w:szCs w:val="22"/>
+                <w:color w:val="000000"/>
+              </w:rPr>
+            </w:pPr>
+            <m:oMath xmlns:mml="http://www.w3.org/1998/Math/MathML">
+              <m:r>
+                <m:t>k21</m:t>
+              </m:r>
+              <m:r>
+                <m:t>=</m:t>
+              </m:r>
+              <m:f>
+                <m:fPr>
+                  <m:type m:val="bar"/>
+                </m:fPr>
+                <m:num>
+                  <m:r>
+                    <m:t>q</m:t>
+                  </m:r>
+                </m:num>
+                <m:den>
+                  <m:r>
+                    <m:t>v2</m:t>
+                  </m:r>
+                </m:den>
+              </m:f>
+            </m:oMath>
+          </w:p>
+        </w:tc>
+      </w:tr>
+      <w:tr>
+        <w:trPr>
+          <w:trHeight w:val="360" w:hRule="auto"/>
+        </w:trPr>
+        <w:tc>
+          <w:tcPr>
+            <w:tcBorders>
+              <w:bottom w:val="none" w:sz="0" w:space="0" w:color="000000"/>
+              <w:top w:val="none" w:sz="0" w:space="0" w:color="000000"/>
+              <w:left w:val="none" w:sz="0" w:space="0" w:color="000000"/>
+              <w:right w:val="none" w:sz="0" w:space="0" w:color="000000"/>
+            </w:tcBorders>
+            <w:shd w:val="clear" w:color="auto" w:fill="FFFFFF"/>
+            <w:tcMar>
+              <w:top w:w="0" w:type="dxa"/>
+              <w:bottom w:w="0" w:type="dxa"/>
+              <w:left w:w="0" w:type="dxa"/>
+              <w:right w:w="0" w:type="dxa"/>
+            </w:tcMar>
+            <w:vAlign w:val="center"/>
+          </w:tcPr>
+          <w:p>
+            <w:pPr>
+              <w:pStyle w:val="Normal"/>
+              <w:jc w:val="left"/>
+              <w:pBdr>
+                <w:bottom w:val="none" w:sz="0" w:space="0" w:color="000000"/>
+                <w:top w:val="none" w:sz="0" w:space="0" w:color="000000"/>
+                <w:left w:val="none" w:sz="0" w:space="0" w:color="000000"/>
+                <w:right w:val="none" w:sz="0" w:space="0" w:color="000000"/>
+              </w:pBdr>
+              <w:spacing w:after="100" w:before="100" w:line="480"/>
+              <w:ind w:left="100" w:right="100" w:firstLine="0" w:firstLineChars="0"/>
+              <w:rPr>
+                <w:rFonts w:ascii="DejaVu Sans" w:hAnsi="DejaVu Sans" w:eastAsia="DejaVu Sans" w:cs="DejaVu Sans"/>
+                <w:i w:val="false"/>
+                <w:b w:val="false"/>
+                <w:u w:val="none"/>
+                <w:strike w:val="false"/>
+                <w:sz w:val="22"/>
+                <w:szCs w:val="22"/>
+                <w:color w:val="000000"/>
+              </w:rPr>
+            </w:pPr>
+            <m:oMath xmlns:mml="http://www.w3.org/1998/Math/MathML">
+              <m:r>
+                <m:t>k12</m:t>
+              </m:r>
+              <m:r>
+                <m:t>=</m:t>
+              </m:r>
+              <m:f>
+                <m:fPr>
+                  <m:type m:val="bar"/>
+                </m:fPr>
+                <m:num>
+                  <m:r>
+                    <m:t>q</m:t>
+                  </m:r>
+                </m:num>
+                <m:den>
+                  <m:r>
+                    <m:t>v</m:t>
+                  </m:r>
+                </m:den>
+              </m:f>
+            </m:oMath>
+          </w:p>
+        </w:tc>
+      </w:tr>
+      <w:tr>
+        <w:trPr>
+          <w:trHeight w:val="360" w:hRule="auto"/>
+        </w:trPr>
+        <w:tc>
+          <w:tcPr>
+            <w:tcBorders>
+              <w:bottom w:val="none" w:sz="0" w:space="0" w:color="000000"/>
+              <w:top w:val="none" w:sz="0" w:space="0" w:color="000000"/>
+              <w:left w:val="none" w:sz="0" w:space="0" w:color="000000"/>
+              <w:right w:val="none" w:sz="0" w:space="0" w:color="000000"/>
+            </w:tcBorders>
+            <w:shd w:val="clear" w:color="auto" w:fill="FFFFFF"/>
+            <w:tcMar>
+              <w:top w:w="0" w:type="dxa"/>
+              <w:bottom w:w="0" w:type="dxa"/>
+              <w:left w:w="0" w:type="dxa"/>
+              <w:right w:w="0" w:type="dxa"/>
+            </w:tcMar>
+            <w:vAlign w:val="center"/>
+          </w:tcPr>
+          <w:p>
+            <w:pPr>
+              <w:pStyle w:val="Normal"/>
+              <w:jc w:val="left"/>
+              <w:pBdr>
+                <w:bottom w:val="none" w:sz="0" w:space="0" w:color="000000"/>
+                <w:top w:val="none" w:sz="0" w:space="0" w:color="000000"/>
+                <w:left w:val="none" w:sz="0" w:space="0" w:color="000000"/>
+                <w:right w:val="none" w:sz="0" w:space="0" w:color="000000"/>
+              </w:pBdr>
+              <w:spacing w:after="100" w:before="100" w:line="480"/>
+              <w:ind w:left="100" w:right="100" w:firstLine="0" w:firstLineChars="0"/>
+              <w:rPr>
+                <w:rFonts w:ascii="DejaVu Sans" w:hAnsi="DejaVu Sans" w:eastAsia="DejaVu Sans" w:cs="DejaVu Sans"/>
+                <w:i w:val="false"/>
+                <w:b w:val="false"/>
+                <w:u w:val="none"/>
+                <w:strike w:val="false"/>
+                <w:sz w:val="22"/>
+                <w:szCs w:val="22"/>
+                <w:color w:val="000000"/>
+              </w:rPr>
+            </w:pPr>
+            <m:oMath xmlns:mml="http://www.w3.org/1998/Math/MathML">
+              <m:f>
+                <m:fPr>
+                  <m:type m:val="bar"/>
+                </m:fPr>
+                <m:num>
+                  <m:r>
+                    <m:t>d</m:t>
+                  </m:r>
+                  <m:r>
+                    <m:rPr>
+                      <m:nor/>
+                    </m:rPr>
+                    <m:t> </m:t>
+                  </m:r>
+                  <m:r>
+                    <m:t>CENTRAL</m:t>
+                  </m:r>
+                </m:num>
+                <m:den>
+                  <m:r>
+                    <m:t>dt</m:t>
+                  </m:r>
+                </m:den>
+              </m:f>
+              <m:r>
+                <m:t>=</m:t>
+              </m:r>
+              <m:r>
+                <m:t>k21</m:t>
+              </m:r>
+              <m:r>
+                <m:t>×</m:t>
+              </m:r>
+              <m:r>
+                <m:t>PERI</m:t>
+              </m:r>
+              <m:r>
+                <m:t>−</m:t>
+              </m:r>
+              <m:r>
+                <m:t>k12</m:t>
+              </m:r>
+              <m:r>
+                <m:t>×</m:t>
+              </m:r>
+              <m:r>
+                <m:t>CENTRAL</m:t>
+              </m:r>
+              <m:r>
+                <m:t>−</m:t>
+              </m:r>
+              <m:f>
+                <m:fPr>
+                  <m:type m:val="bar"/>
+                </m:fPr>
+                <m:num>
+                  <m:r>
+                    <m:t>cl</m:t>
+                  </m:r>
+                  <m:r>
+                    <m:t>×</m:t>
+                  </m:r>
+                  <m:r>
+                    <m:t>CENTRAL</m:t>
+                  </m:r>
+                </m:num>
+                <m:den>
+                  <m:r>
+                    <m:t>v1</m:t>
+                  </m:r>
+                </m:den>
+              </m:f>
+            </m:oMath>
+          </w:p>
+        </w:tc>
+      </w:tr>
+      <w:tr>
+        <w:trPr>
+          <w:trHeight w:val="360" w:hRule="auto"/>
+        </w:trPr>
+        <w:tc>
+          <w:tcPr>
+            <w:tcBorders>
+              <w:bottom w:val="none" w:sz="0" w:space="0" w:color="000000"/>
+              <w:top w:val="none" w:sz="0" w:space="0" w:color="000000"/>
+              <w:left w:val="none" w:sz="0" w:space="0" w:color="000000"/>
+              <w:right w:val="none" w:sz="0" w:space="0" w:color="000000"/>
+            </w:tcBorders>
+            <w:shd w:val="clear" w:color="auto" w:fill="FFFFFF"/>
+            <w:tcMar>
+              <w:top w:w="0" w:type="dxa"/>
+              <w:bottom w:w="0" w:type="dxa"/>
+              <w:left w:w="0" w:type="dxa"/>
+              <w:right w:w="0" w:type="dxa"/>
+            </w:tcMar>
+            <w:vAlign w:val="center"/>
+          </w:tcPr>
+          <w:p>
+            <w:pPr>
+              <w:pStyle w:val="Normal"/>
+              <w:jc w:val="left"/>
+              <w:pBdr>
+                <w:bottom w:val="none" w:sz="0" w:space="0" w:color="000000"/>
+                <w:top w:val="none" w:sz="0" w:space="0" w:color="000000"/>
+                <w:left w:val="none" w:sz="0" w:space="0" w:color="000000"/>
+                <w:right w:val="none" w:sz="0" w:space="0" w:color="000000"/>
+              </w:pBdr>
+              <w:spacing w:after="100" w:before="100" w:line="480"/>
+              <w:ind w:left="100" w:right="100" w:firstLine="0" w:firstLineChars="0"/>
+              <w:rPr>
+                <w:rFonts w:ascii="DejaVu Sans" w:hAnsi="DejaVu Sans" w:eastAsia="DejaVu Sans" w:cs="DejaVu Sans"/>
+                <w:i w:val="false"/>
+                <w:b w:val="false"/>
+                <w:u w:val="none"/>
+                <w:strike w:val="false"/>
+                <w:sz w:val="22"/>
+                <w:szCs w:val="22"/>
+                <w:color w:val="000000"/>
+              </w:rPr>
+            </w:pPr>
+            <m:oMath xmlns:mml="http://www.w3.org/1998/Math/MathML">
+              <m:f>
+                <m:fPr>
+                  <m:type m:val="bar"/>
+                </m:fPr>
+                <m:num>
+                  <m:r>
+                    <m:t>d</m:t>
+                  </m:r>
+                  <m:r>
+                    <m:rPr>
+                      <m:nor/>
+                    </m:rPr>
+                    <m:t> </m:t>
+                  </m:r>
+                  <m:r>
+                    <m:t>PERI</m:t>
+                  </m:r>
+                </m:num>
+                <m:den>
+                  <m:r>
+                    <m:t>dt</m:t>
+                  </m:r>
+                </m:den>
+              </m:f>
+              <m:r>
+                <m:t>=−</m:t>
+              </m:r>
+              <m:r>
+                <m:t>k21</m:t>
+              </m:r>
+              <m:r>
+                <m:t>×</m:t>
+              </m:r>
+              <m:r>
+                <m:t>PERI</m:t>
+              </m:r>
+              <m:r>
+                <m:t>+</m:t>
+              </m:r>
+              <m:r>
+                <m:t>k12</m:t>
+              </m:r>
+              <m:r>
+                <m:t>×</m:t>
+              </m:r>
+              <m:r>
+                <m:t>CENTRAL</m:t>
+              </m:r>
+            </m:oMath>
+          </w:p>
+        </w:tc>
+      </w:tr>
+      <w:tr>
+        <w:trPr>
+          <w:trHeight w:val="360" w:hRule="auto"/>
+        </w:trPr>
+        <w:tc>
+          <w:tcPr>
+            <w:tcBorders>
+              <w:bottom w:val="none" w:sz="0" w:space="0" w:color="000000"/>
+              <w:top w:val="none" w:sz="0" w:space="0" w:color="000000"/>
+              <w:left w:val="none" w:sz="0" w:space="0" w:color="000000"/>
+              <w:right w:val="none" w:sz="0" w:space="0" w:color="000000"/>
+            </w:tcBorders>
+            <w:shd w:val="clear" w:color="auto" w:fill="FFFFFF"/>
+            <w:tcMar>
+              <w:top w:w="0" w:type="dxa"/>
+              <w:bottom w:w="0" w:type="dxa"/>
+              <w:left w:w="0" w:type="dxa"/>
+              <w:right w:w="0" w:type="dxa"/>
+            </w:tcMar>
+            <w:vAlign w:val="center"/>
+          </w:tcPr>
+          <w:p>
+            <w:pPr>
+              <w:pStyle w:val="Normal"/>
+              <w:jc w:val="left"/>
+              <w:pBdr>
+                <w:bottom w:val="none" w:sz="0" w:space="0" w:color="000000"/>
+                <w:top w:val="none" w:sz="0" w:space="0" w:color="000000"/>
+                <w:left w:val="none" w:sz="0" w:space="0" w:color="000000"/>
+                <w:right w:val="none" w:sz="0" w:space="0" w:color="000000"/>
+              </w:pBdr>
+              <w:spacing w:after="100" w:before="100" w:line="480"/>
+              <w:ind w:left="100" w:right="100" w:firstLine="0" w:firstLineChars="0"/>
+              <w:rPr>
+                <w:rFonts w:ascii="DejaVu Sans" w:hAnsi="DejaVu Sans" w:eastAsia="DejaVu Sans" w:cs="DejaVu Sans"/>
+                <w:i w:val="false"/>
+                <w:b w:val="false"/>
+                <w:u w:val="none"/>
+                <w:strike w:val="false"/>
+                <w:sz w:val="22"/>
+                <w:szCs w:val="22"/>
+                <w:color w:val="000000"/>
+              </w:rPr>
+            </w:pPr>
+            <m:oMath xmlns:mml="http://www.w3.org/1998/Math/MathML">
+              <m:r>
+                <m:t>f=</m:t>
+              </m:r>
+              <m:f>
+                <m:fPr>
+                  <m:type m:val="bar"/>
+                </m:fPr>
+                <m:num>
+                  <m:r>
+                    <m:t>CENTRAL</m:t>
+                  </m:r>
+                </m:num>
+                <m:den>
+                  <m:r>
+                    <m:t>scale1</m:t>
+                  </m:r>
+                </m:den>
+              </m:f>
+            </m:oMath>
+          </w:p>
+        </w:tc>
+      </w:tr>
+      <w:tr>
+        <w:trPr>
+          <w:trHeight w:val="360" w:hRule="auto"/>
+        </w:trPr>
+        <w:tc>
+          <w:tcPr>
+            <w:tcBorders>
+              <w:bottom w:val="none" w:sz="0" w:space="0" w:color="000000"/>
+              <w:top w:val="none" w:sz="0" w:space="0" w:color="000000"/>
+              <w:left w:val="none" w:sz="0" w:space="0" w:color="000000"/>
+              <w:right w:val="none" w:sz="0" w:space="0" w:color="000000"/>
+            </w:tcBorders>
+            <w:shd w:val="clear" w:color="auto" w:fill="FFFFFF"/>
+            <w:tcMar>
+              <w:top w:w="0" w:type="dxa"/>
+              <w:bottom w:w="0" w:type="dxa"/>
+              <w:left w:w="0" w:type="dxa"/>
+              <w:right w:w="0" w:type="dxa"/>
+            </w:tcMar>
+            <w:vAlign w:val="center"/>
+          </w:tcPr>
+          <w:p>
+            <w:pPr>
+              <w:pStyle w:val="Normal"/>
+              <w:jc w:val="left"/>
+              <w:pBdr>
+                <w:bottom w:val="none" w:sz="0" w:space="0" w:color="000000"/>
+                <w:top w:val="none" w:sz="0" w:space="0" w:color="000000"/>
+                <w:left w:val="none" w:sz="0" w:space="0" w:color="000000"/>
+                <w:right w:val="none" w:sz="0" w:space="0" w:color="000000"/>
+              </w:pBdr>
+              <w:spacing w:after="100" w:before="100" w:line="480"/>
+              <w:ind w:left="100" w:right="100" w:firstLine="0" w:firstLineChars="0"/>
+              <w:rPr>
+                <w:rFonts w:ascii="DejaVu Sans" w:hAnsi="DejaVu Sans" w:eastAsia="DejaVu Sans" w:cs="DejaVu Sans"/>
+                <w:i w:val="false"/>
+                <w:b w:val="false"/>
+                <w:u w:val="none"/>
+                <w:strike w:val="false"/>
+                <w:sz w:val="22"/>
+                <w:szCs w:val="22"/>
+                <w:color w:val="000000"/>
+              </w:rPr>
+            </w:pPr>
+            <m:oMath xmlns:mml="http://www.w3.org/1998/Math/MathML">
+              <m:r>
+                <m:t>ipred</m:t>
+              </m:r>
+              <m:r>
+                <m:t>=f</m:t>
+              </m:r>
+            </m:oMath>
+          </w:p>
+        </w:tc>
+      </w:tr>
+      <w:tr>
+        <w:trPr>
+          <w:trHeight w:val="360" w:hRule="auto"/>
+        </w:trPr>
+        <w:tc>
+          <w:tcPr>
+            <w:tcBorders>
+              <w:bottom w:val="none" w:sz="0" w:space="0" w:color="000000"/>
+              <w:top w:val="none" w:sz="0" w:space="0" w:color="000000"/>
+              <w:left w:val="none" w:sz="0" w:space="0" w:color="000000"/>
+              <w:right w:val="none" w:sz="0" w:space="0" w:color="000000"/>
+            </w:tcBorders>
+            <w:shd w:val="clear" w:color="auto" w:fill="FFFFFF"/>
+            <w:tcMar>
+              <w:top w:w="0" w:type="dxa"/>
+              <w:bottom w:w="0" w:type="dxa"/>
+              <w:left w:w="0" w:type="dxa"/>
+              <w:right w:w="0" w:type="dxa"/>
+            </w:tcMar>
+            <w:vAlign w:val="center"/>
+          </w:tcPr>
+          <w:p>
+            <w:pPr>
+              <w:pStyle w:val="Normal"/>
+              <w:jc w:val="left"/>
+              <w:pBdr>
+                <w:bottom w:val="none" w:sz="0" w:space="0" w:color="000000"/>
+                <w:top w:val="none" w:sz="0" w:space="0" w:color="000000"/>
+                <w:left w:val="none" w:sz="0" w:space="0" w:color="000000"/>
+                <w:right w:val="none" w:sz="0" w:space="0" w:color="000000"/>
+              </w:pBdr>
+              <w:spacing w:after="100" w:before="100" w:line="480"/>
+              <w:ind w:left="100" w:right="100" w:firstLine="0" w:firstLineChars="0"/>
+              <w:rPr>
+                <w:rFonts w:ascii="DejaVu Sans" w:hAnsi="DejaVu Sans" w:eastAsia="DejaVu Sans" w:cs="DejaVu Sans"/>
+                <w:i w:val="false"/>
+                <w:b w:val="false"/>
+                <w:u w:val="none"/>
+                <w:strike w:val="false"/>
+                <w:sz w:val="22"/>
+                <w:szCs w:val="22"/>
+                <w:color w:val="000000"/>
+              </w:rPr>
+            </w:pPr>
+            <m:oMath xmlns:mml="http://www.w3.org/1998/Math/MathML">
+              <m:r>
+                <m:t>rescv</m:t>
+              </m:r>
+              <m:r>
+                <m:t>=</m:t>
+              </m:r>
+              <m:r>
+                <m:t>RSV</m:t>
+              </m:r>
+            </m:oMath>
+          </w:p>
+        </w:tc>
+      </w:tr>
+      <w:tr>
+        <w:trPr>
+          <w:trHeight w:val="360" w:hRule="auto"/>
+        </w:trPr>
+        <w:tc>
+          <w:tcPr>
+            <w:tcBorders>
+              <w:bottom w:val="none" w:sz="0" w:space="0" w:color="000000"/>
+              <w:top w:val="none" w:sz="0" w:space="0" w:color="000000"/>
+              <w:left w:val="none" w:sz="0" w:space="0" w:color="000000"/>
+              <w:right w:val="none" w:sz="0" w:space="0" w:color="000000"/>
+            </w:tcBorders>
+            <w:shd w:val="clear" w:color="auto" w:fill="FFFFFF"/>
+            <w:tcMar>
+              <w:top w:w="0" w:type="dxa"/>
+              <w:bottom w:w="0" w:type="dxa"/>
+              <w:left w:w="0" w:type="dxa"/>
+              <w:right w:w="0" w:type="dxa"/>
+            </w:tcMar>
+            <w:vAlign w:val="center"/>
+          </w:tcPr>
+          <w:p>
+            <w:pPr>
+              <w:pStyle w:val="Normal"/>
+              <w:jc w:val="left"/>
+              <w:pBdr>
+                <w:bottom w:val="none" w:sz="0" w:space="0" w:color="000000"/>
+                <w:top w:val="none" w:sz="0" w:space="0" w:color="000000"/>
+                <w:left w:val="none" w:sz="0" w:space="0" w:color="000000"/>
+                <w:right w:val="none" w:sz="0" w:space="0" w:color="000000"/>
+              </w:pBdr>
+              <w:spacing w:after="100" w:before="100" w:line="480"/>
+              <w:ind w:left="100" w:right="100" w:firstLine="0" w:firstLineChars="0"/>
+              <w:rPr>
+                <w:rFonts w:ascii="DejaVu Sans" w:hAnsi="DejaVu Sans" w:eastAsia="DejaVu Sans" w:cs="DejaVu Sans"/>
+                <w:i w:val="false"/>
+                <w:b w:val="false"/>
+                <w:u w:val="none"/>
+                <w:strike w:val="false"/>
+                <w:sz w:val="22"/>
+                <w:szCs w:val="22"/>
+                <w:color w:val="000000"/>
+              </w:rPr>
+            </w:pPr>
+            <m:oMath xmlns:mml="http://www.w3.org/1998/Math/MathML">
+              <m:r>
+                <m:t>ipred</m:t>
+              </m:r>
+              <m:r>
+                <m:t>∼prop(</m:t>
+              </m:r>
+              <m:r>
+                <m:t>RSV</m:t>
+              </m:r>
+              <m:r>
+                <m:t>)</m:t>
+              </m:r>
+            </m:oMath>
+          </w:p>
+        </w:tc>
+      </w:tr>
+    </w:tbl>
+    <w:p>
+      <w:pPr>
+        <w:pStyle w:val="tabletitle"/>
+      </w:pPr>
+      <w:r>
+        <w:rPr>
+          <w:rFonts/>
+          <w:strike w:val="false"/>
+        </w:rPr>
+        <w:t xml:space="preserve">Table </w:t>
+      </w:r>
+      <w:bookmarkStart w:id="94065913-0002-45ce-b692-a631c42a4ef3" w:name="model_equations"/>
+      <w:r>
+        <w:rPr/>
+        <w:t xml:space="preserve"/>
+      </w:r>
+      <w:r>
+        <w:rPr/>
+        <w:fldChar w:fldCharType="begin" w:dirty="true"/>
+      </w:r>
+      <w:r>
+        <w:rPr/>
+        <w:instrText xml:space="preserve" w:dirty="true">SEQ Table \* Arabic</w:instrText>
+      </w:r>
+      <w:r>
+        <w:rPr/>
+        <w:fldChar w:fldCharType="end" w:dirty="true"/>
+      </w:r>
+      <w:r>
+        <w:rPr/>
+        <w:t xml:space="preserve"/>
+      </w:r>
+      <w:bookmarkEnd w:id="94065913-0002-45ce-b692-a631c42a4ef3"/>
+      <w:r>
+        <w:rPr>
+          <w:rFonts/>
+          <w:strike w:val="false"/>
+        </w:rPr>
+        <w:t xml:space="preserve">. </w:t>
+      </w:r>
+      <w:r>
+        <w:rPr>
+          <w:rFonts/>
+          <w:strike w:val="false"/>
+        </w:rPr>
+        <w:t xml:space="preserve">Model equations</w:t>
+      </w:r>
+    </w:p>
+    <w:p>
+      <w:pPr/>
+      <w:r>
+        <w:br w:type="page"/>
+      </w:r>
+    </w:p>
     <w:p>
       <w:pPr>
         <w:pStyle w:val="Heading1"/>
@@ -2379,7 +3685,7 @@
         </w:rPr>
         <w:t xml:space="preserve">Table </w:t>
       </w:r>
-      <w:bookmarkStart w:id="98998878-3cf7-475e-a969-9587e84698d0" w:name="pest_table"/>
+      <w:bookmarkStart w:id="e82c87cc-2354-4047-a8a4-51c0c0189512" w:name="pest_table"/>
       <w:r>
         <w:rPr/>
         <w:t xml:space="preserve"/>
@@ -2400,7 +3706,7 @@
         <w:rPr/>
         <w:t xml:space="preserve"/>
       </w:r>
-      <w:bookmarkEnd w:id="98998878-3cf7-475e-a969-9587e84698d0"/>
+      <w:bookmarkEnd w:id="e82c87cc-2354-4047-a8a4-51c0c0189512"/>
       <w:r>
         <w:rPr>
           <w:rFonts/>
@@ -2439,105 +3745,6 @@
           <w:cols/>
         </w:sectPr>
       </w:pPr>
-    </w:p>
-    <w:p>
-      <w:pPr>
-        <w:pStyle w:val="Normal"/>
-      </w:pPr>
-      <w:r>
-        <w:rPr/>
-        <w:drawing>
-          <wp:inline distT="0" distB="0" distL="0" distR="0">
-            <wp:extent cx="7315200" cy="3840480"/>
-            <wp:docPr id="1" name="" descr=""/>
-            <wp:cNvGraphicFramePr>
-              <a:graphicFrameLocks xmlns:a="http://schemas.openxmlformats.org/drawingml/2006/main" noChangeAspect="1"/>
-            </wp:cNvGraphicFramePr>
-            <a:graphic xmlns:a="http://schemas.openxmlformats.org/drawingml/2006/main">
-              <a:graphicData uri="http://schemas.openxmlformats.org/drawingml/2006/picture">
-                <pic:pic xmlns:pic="http://schemas.openxmlformats.org/drawingml/2006/picture">
-                  <pic:nvPicPr>
-                    <pic:cNvPr id="2" name=""/>
-                    <pic:cNvPicPr>
-                      <a:picLocks noChangeAspect="1" noChangeArrowheads="1"/>
-                    </pic:cNvPicPr>
-                  </pic:nvPicPr>
-                  <pic:blipFill>
-                    <a:blip r:embed="rId16"/>
-                    <a:stretch>
-                      <a:fillRect/>
-                    </a:stretch>
-                  </pic:blipFill>
-                  <pic:spPr bwMode="auto">
-                    <a:xfrm>
-                      <a:off x="0" y="0"/>
-                      <a:ext cx="7315200" cy="3840480"/>
-                    </a:xfrm>
-                    <a:prstGeom prst="rect">
-                      <a:avLst/>
-                    </a:prstGeom>
-                    <a:noFill/>
-                  </pic:spPr>
-                </pic:pic>
-              </a:graphicData>
-            </a:graphic>
-          </wp:inline>
-        </w:drawing>
-      </w:r>
-    </w:p>
-    <w:p>
-      <w:pPr>
-        <w:pStyle w:val="graphictitle"/>
-      </w:pPr>
-      <w:r>
-        <w:rPr>
-          <w:rFonts/>
-          <w:strike w:val="false"/>
-        </w:rPr>
-        <w:t xml:space="preserve">Figure </w:t>
-      </w:r>
-      <w:bookmarkStart w:id="b57312bd-c5dd-45a9-8076-3e0e9919b8db" w:name="ind_plots"/>
-      <w:r>
-        <w:rPr/>
-        <w:t xml:space="preserve"/>
-      </w:r>
-      <w:r>
-        <w:rPr/>
-        <w:fldChar w:fldCharType="begin" w:dirty="true"/>
-      </w:r>
-      <w:r>
-        <w:rPr/>
-        <w:instrText xml:space="preserve" w:dirty="true">SEQ Figure \* Arabic</w:instrText>
-      </w:r>
-      <w:r>
-        <w:rPr/>
-        <w:fldChar w:fldCharType="end" w:dirty="true"/>
-      </w:r>
-      <w:r>
-        <w:rPr/>
-        <w:t xml:space="preserve"/>
-      </w:r>
-      <w:bookmarkEnd w:id="b57312bd-c5dd-45a9-8076-3e0e9919b8db"/>
-      <w:r>
-        <w:rPr>
-          <w:rFonts/>
-          <w:strike w:val="false"/>
-        </w:rPr>
-        <w:t xml:space="preserve">. </w:t>
-      </w:r>
-      <w:r>
-        <w:rPr>
-          <w:rFonts/>
-          <w:strike w:val="false"/>
-        </w:rPr>
-        <w:t xml:space="preserve">Individual and population prediction overlay</w:t>
-      </w:r>
-    </w:p>
-    <w:p>
-      <w:pPr/>
-      <w:r>
-        <w:br w:type="page"/>
-      </w:r>
     </w:p>
     <w:p>
       <w:pPr>
@@ -2595,18 +3802,28 @@
         </w:rPr>
         <w:t xml:space="preserve">Figure </w:t>
       </w:r>
+      <w:bookmarkStart w:id="bed2c25a-8ba1-4691-bd11-a72905e238fe" w:name="ind_plots"/>
+      <w:r>
+        <w:rPr/>
+        <w:t xml:space="preserve"/>
+      </w:r>
       <w:r>
         <w:rPr/>
         <w:fldChar w:fldCharType="begin" w:dirty="true"/>
       </w:r>
       <w:r>
         <w:rPr/>
-        <w:instrText xml:space="preserve" w:dirty="true"> REF ind_plots \h </w:instrText>
+        <w:instrText xml:space="preserve" w:dirty="true">SEQ Figure \* Arabic</w:instrText>
       </w:r>
       <w:r>
         <w:rPr/>
         <w:fldChar w:fldCharType="end" w:dirty="true"/>
       </w:r>
+      <w:r>
+        <w:rPr/>
+        <w:t xml:space="preserve"/>
+      </w:r>
+      <w:bookmarkEnd w:id="bed2c25a-8ba1-4691-bd11-a72905e238fe"/>
       <w:r>
         <w:rPr>
           <w:rFonts/>
@@ -3335,14 +4552,10 @@
       </w:r>
     </w:p>
     <w:p>
-      <w:pPr>
-        <w:sectPr>
-          <w:pgMar w:header="708" w:bottom="1417" w:top="1417" w:right="1417" w:left="1417" w:footer="708" w:gutter="0"/>
-          <w:pgSz w:h="11906" w:w="16838" w:orient="landscape"/>
-          <w:type w:val="oddPage"/>
-          <w:cols/>
-        </w:sectPr>
-      </w:pPr>
+      <w:pPr/>
+      <w:r>
+        <w:br w:type="page"/>
+      </w:r>
     </w:p>
     <w:p>
       <w:pPr>
@@ -3352,7 +4565,7 @@
         <w:rPr/>
         <w:drawing>
           <wp:inline distT="0" distB="0" distL="0" distR="0">
-            <wp:extent cx="5943600" cy="5486400"/>
+            <wp:extent cx="7315200" cy="3840480"/>
             <wp:docPr id="21" name="" descr=""/>
             <wp:cNvGraphicFramePr>
               <a:graphicFrameLocks xmlns:a="http://schemas.openxmlformats.org/drawingml/2006/main" noChangeAspect="1"/>
@@ -3375,7 +4588,7 @@
                   <pic:spPr bwMode="auto">
                     <a:xfrm>
                       <a:off x="0" y="0"/>
-                      <a:ext cx="5943600" cy="5486400"/>
+                      <a:ext cx="7315200" cy="3840480"/>
                     </a:xfrm>
                     <a:prstGeom prst="rect">
                       <a:avLst/>
@@ -3400,28 +4613,18 @@
         </w:rPr>
         <w:t xml:space="preserve">Figure </w:t>
       </w:r>
-      <w:bookmarkStart w:id="ddd4efc9-c40f-4e52-932e-99d29b8af2b6" w:name="dv_vs_pred_ipred"/>
-      <w:r>
-        <w:rPr/>
-        <w:t xml:space="preserve"/>
-      </w:r>
       <w:r>
         <w:rPr/>
         <w:fldChar w:fldCharType="begin" w:dirty="true"/>
       </w:r>
       <w:r>
         <w:rPr/>
-        <w:instrText xml:space="preserve" w:dirty="true">SEQ Figure \* Arabic</w:instrText>
+        <w:instrText xml:space="preserve" w:dirty="true"> REF ind_plots \h </w:instrText>
       </w:r>
       <w:r>
         <w:rPr/>
         <w:fldChar w:fldCharType="end" w:dirty="true"/>
       </w:r>
-      <w:r>
-        <w:rPr/>
-        <w:t xml:space="preserve"/>
-      </w:r>
-      <w:bookmarkEnd w:id="ddd4efc9-c40f-4e52-932e-99d29b8af2b6"/>
       <w:r>
         <w:rPr>
           <w:rFonts/>
@@ -3434,20 +4637,14 @@
           <w:rFonts/>
           <w:strike w:val="false"/>
         </w:rPr>
-        <w:t xml:space="preserve">Observed vs Predicted</w:t>
-      </w:r>
-    </w:p>
-    <w:p>
-      <w:pPr/>
-      <w:r>
-        <w:br w:type="page"/>
+        <w:t xml:space="preserve">Individual and population prediction overlay</w:t>
       </w:r>
     </w:p>
     <w:p>
       <w:pPr>
         <w:sectPr>
           <w:pgMar w:header="708" w:bottom="1417" w:top="1417" w:right="1417" w:left="1417" w:footer="708" w:gutter="0"/>
-          <w:pgSz w:h="16838" w:w="11906" w:orient="portrait"/>
+          <w:pgSz w:h="11906" w:w="16838" w:orient="landscape"/>
           <w:type w:val="oddPage"/>
           <w:cols/>
         </w:sectPr>
@@ -3461,7 +4658,7 @@
         <w:rPr/>
         <w:drawing>
           <wp:inline distT="0" distB="0" distL="0" distR="0">
-            <wp:extent cx="7315200" cy="3840480"/>
+            <wp:extent cx="5943600" cy="5486400"/>
             <wp:docPr id="23" name="" descr=""/>
             <wp:cNvGraphicFramePr>
               <a:graphicFrameLocks xmlns:a="http://schemas.openxmlformats.org/drawingml/2006/main" noChangeAspect="1"/>
@@ -3484,6 +4681,115 @@
                   <pic:spPr bwMode="auto">
                     <a:xfrm>
                       <a:off x="0" y="0"/>
+                      <a:ext cx="5943600" cy="5486400"/>
+                    </a:xfrm>
+                    <a:prstGeom prst="rect">
+                      <a:avLst/>
+                    </a:prstGeom>
+                    <a:noFill/>
+                  </pic:spPr>
+                </pic:pic>
+              </a:graphicData>
+            </a:graphic>
+          </wp:inline>
+        </w:drawing>
+      </w:r>
+    </w:p>
+    <w:p>
+      <w:pPr>
+        <w:pStyle w:val="graphictitle"/>
+      </w:pPr>
+      <w:r>
+        <w:rPr>
+          <w:rFonts/>
+          <w:strike w:val="false"/>
+        </w:rPr>
+        <w:t xml:space="preserve">Figure </w:t>
+      </w:r>
+      <w:bookmarkStart w:id="fb4bfdea-5357-40d5-b3de-292891a52f78" w:name="dv_vs_pred_ipred"/>
+      <w:r>
+        <w:rPr/>
+        <w:t xml:space="preserve"/>
+      </w:r>
+      <w:r>
+        <w:rPr/>
+        <w:fldChar w:fldCharType="begin" w:dirty="true"/>
+      </w:r>
+      <w:r>
+        <w:rPr/>
+        <w:instrText xml:space="preserve" w:dirty="true">SEQ Figure \* Arabic</w:instrText>
+      </w:r>
+      <w:r>
+        <w:rPr/>
+        <w:fldChar w:fldCharType="end" w:dirty="true"/>
+      </w:r>
+      <w:r>
+        <w:rPr/>
+        <w:t xml:space="preserve"/>
+      </w:r>
+      <w:bookmarkEnd w:id="fb4bfdea-5357-40d5-b3de-292891a52f78"/>
+      <w:r>
+        <w:rPr>
+          <w:rFonts/>
+          <w:strike w:val="false"/>
+        </w:rPr>
+        <w:t xml:space="preserve">. </w:t>
+      </w:r>
+      <w:r>
+        <w:rPr>
+          <w:rFonts/>
+          <w:strike w:val="false"/>
+        </w:rPr>
+        <w:t xml:space="preserve">Observed vs Predicted</w:t>
+      </w:r>
+    </w:p>
+    <w:p>
+      <w:pPr/>
+      <w:r>
+        <w:br w:type="page"/>
+      </w:r>
+    </w:p>
+    <w:p>
+      <w:pPr>
+        <w:sectPr>
+          <w:pgMar w:header="708" w:bottom="1417" w:top="1417" w:right="1417" w:left="1417" w:footer="708" w:gutter="0"/>
+          <w:pgSz w:h="16838" w:w="11906" w:orient="portrait"/>
+          <w:type w:val="oddPage"/>
+          <w:cols/>
+        </w:sectPr>
+      </w:pPr>
+    </w:p>
+    <w:p>
+      <w:pPr>
+        <w:pStyle w:val="Normal"/>
+      </w:pPr>
+      <w:r>
+        <w:rPr/>
+        <w:drawing>
+          <wp:inline distT="0" distB="0" distL="0" distR="0">
+            <wp:extent cx="7315200" cy="3840480"/>
+            <wp:docPr id="25" name="" descr=""/>
+            <wp:cNvGraphicFramePr>
+              <a:graphicFrameLocks xmlns:a="http://schemas.openxmlformats.org/drawingml/2006/main" noChangeAspect="1"/>
+            </wp:cNvGraphicFramePr>
+            <a:graphic xmlns:a="http://schemas.openxmlformats.org/drawingml/2006/main">
+              <a:graphicData uri="http://schemas.openxmlformats.org/drawingml/2006/picture">
+                <pic:pic xmlns:pic="http://schemas.openxmlformats.org/drawingml/2006/picture">
+                  <pic:nvPicPr>
+                    <pic:cNvPr id="26" name=""/>
+                    <pic:cNvPicPr>
+                      <a:picLocks noChangeAspect="1" noChangeArrowheads="1"/>
+                    </pic:cNvPicPr>
+                  </pic:nvPicPr>
+                  <pic:blipFill>
+                    <a:blip r:embed="rId28"/>
+                    <a:stretch>
+                      <a:fillRect/>
+                    </a:stretch>
+                  </pic:blipFill>
+                  <pic:spPr bwMode="auto">
+                    <a:xfrm>
+                      <a:off x="0" y="0"/>
                       <a:ext cx="7315200" cy="3840480"/>
                     </a:xfrm>
                     <a:prstGeom prst="rect">
@@ -3509,7 +4815,7 @@
         </w:rPr>
         <w:t xml:space="preserve">Figure </w:t>
       </w:r>
-      <w:bookmarkStart w:id="d00d827e-e5c7-4b93-9b6e-d37c29f2c980" w:name="prm_vs_iteration"/>
+      <w:bookmarkStart w:id="5cf1570e-4a48-4a07-b6fc-64ab5126cf3d" w:name="prm_vs_iteration"/>
       <w:r>
         <w:rPr/>
         <w:t xml:space="preserve"/>
@@ -3530,7 +4836,7 @@
         <w:rPr/>
         <w:t xml:space="preserve"/>
       </w:r>
-      <w:bookmarkEnd w:id="d00d827e-e5c7-4b93-9b6e-d37c29f2c980"/>
+      <w:bookmarkEnd w:id="5cf1570e-4a48-4a07-b6fc-64ab5126cf3d"/>
       <w:r>
         <w:rPr>
           <w:rFonts/>

</xml_diff>

<commit_message>
Deploying to gh-pages from @ nlmixr2/nonmem2rx@082770a758546c2fda8963e2a989e801582970a5 🚀
</commit_message>
<xml_diff>
--- a/articles/mod-Word.docx
+++ b/articles/mod-Word.docx
@@ -67,7 +67,7 @@
         </w:rPr>
         <w:t xml:space="preserve">Figure </w:t>
       </w:r>
-      <w:bookmarkStart w:id="affe1409-828c-40b3-8872-446565762595" w:name="model_diagram"/>
+      <w:bookmarkStart w:id="463f75c4-a578-4eb6-974d-84b8ac7509f6" w:name="model_diagram"/>
       <w:r>
         <w:rPr/>
         <w:t xml:space="preserve"/>
@@ -88,7 +88,7 @@
         <w:rPr/>
         <w:t xml:space="preserve"/>
       </w:r>
-      <w:bookmarkEnd w:id="affe1409-828c-40b3-8872-446565762595"/>
+      <w:bookmarkEnd w:id="463f75c4-a578-4eb6-974d-84b8ac7509f6"/>
       <w:r>
         <w:rPr>
           <w:rFonts/>
@@ -1266,7 +1266,7 @@
         </w:rPr>
         <w:t xml:space="preserve">Table </w:t>
       </w:r>
-      <w:bookmarkStart w:id="94065913-0002-45ce-b692-a631c42a4ef3" w:name="model_equations"/>
+      <w:bookmarkStart w:id="58de222c-05b7-4e88-b368-2bcbdbb76924" w:name="model_equations"/>
       <w:r>
         <w:rPr/>
         <w:t xml:space="preserve"/>
@@ -1287,7 +1287,7 @@
         <w:rPr/>
         <w:t xml:space="preserve"/>
       </w:r>
-      <w:bookmarkEnd w:id="94065913-0002-45ce-b692-a631c42a4ef3"/>
+      <w:bookmarkEnd w:id="58de222c-05b7-4e88-b368-2bcbdbb76924"/>
       <w:r>
         <w:rPr>
           <w:rFonts/>
@@ -3685,7 +3685,7 @@
         </w:rPr>
         <w:t xml:space="preserve">Table </w:t>
       </w:r>
-      <w:bookmarkStart w:id="e82c87cc-2354-4047-a8a4-51c0c0189512" w:name="pest_table"/>
+      <w:bookmarkStart w:id="9a14ee95-83cd-4b26-90d0-777203e521a4" w:name="pest_table"/>
       <w:r>
         <w:rPr/>
         <w:t xml:space="preserve"/>
@@ -3706,7 +3706,7 @@
         <w:rPr/>
         <w:t xml:space="preserve"/>
       </w:r>
-      <w:bookmarkEnd w:id="e82c87cc-2354-4047-a8a4-51c0c0189512"/>
+      <w:bookmarkEnd w:id="9a14ee95-83cd-4b26-90d0-777203e521a4"/>
       <w:r>
         <w:rPr>
           <w:rFonts/>
@@ -3802,7 +3802,7 @@
         </w:rPr>
         <w:t xml:space="preserve">Figure </w:t>
       </w:r>
-      <w:bookmarkStart w:id="bed2c25a-8ba1-4691-bd11-a72905e238fe" w:name="ind_plots"/>
+      <w:bookmarkStart w:id="69e7298a-f3d9-4d3c-94e4-40b1b5325440" w:name="ind_plots"/>
       <w:r>
         <w:rPr/>
         <w:t xml:space="preserve"/>
@@ -3823,7 +3823,7 @@
         <w:rPr/>
         <w:t xml:space="preserve"/>
       </w:r>
-      <w:bookmarkEnd w:id="bed2c25a-8ba1-4691-bd11-a72905e238fe"/>
+      <w:bookmarkEnd w:id="69e7298a-f3d9-4d3c-94e4-40b1b5325440"/>
       <w:r>
         <w:rPr>
           <w:rFonts/>
@@ -4706,7 +4706,7 @@
         </w:rPr>
         <w:t xml:space="preserve">Figure </w:t>
       </w:r>
-      <w:bookmarkStart w:id="fb4bfdea-5357-40d5-b3de-292891a52f78" w:name="dv_vs_pred_ipred"/>
+      <w:bookmarkStart w:id="971e550e-f0cd-433a-9969-68840efc0d6a" w:name="dv_vs_pred_ipred"/>
       <w:r>
         <w:rPr/>
         <w:t xml:space="preserve"/>
@@ -4727,7 +4727,7 @@
         <w:rPr/>
         <w:t xml:space="preserve"/>
       </w:r>
-      <w:bookmarkEnd w:id="fb4bfdea-5357-40d5-b3de-292891a52f78"/>
+      <w:bookmarkEnd w:id="971e550e-f0cd-433a-9969-68840efc0d6a"/>
       <w:r>
         <w:rPr>
           <w:rFonts/>
@@ -4815,7 +4815,7 @@
         </w:rPr>
         <w:t xml:space="preserve">Figure </w:t>
       </w:r>
-      <w:bookmarkStart w:id="5cf1570e-4a48-4a07-b6fc-64ab5126cf3d" w:name="prm_vs_iteration"/>
+      <w:bookmarkStart w:id="6ba85d9a-3592-4c82-afc6-ebec183558aa" w:name="prm_vs_iteration"/>
       <w:r>
         <w:rPr/>
         <w:t xml:space="preserve"/>
@@ -4836,7 +4836,7 @@
         <w:rPr/>
         <w:t xml:space="preserve"/>
       </w:r>
-      <w:bookmarkEnd w:id="5cf1570e-4a48-4a07-b6fc-64ab5126cf3d"/>
+      <w:bookmarkEnd w:id="6ba85d9a-3592-4c82-afc6-ebec183558aa"/>
       <w:r>
         <w:rPr>
           <w:rFonts/>

</xml_diff>

<commit_message>
Deploying to gh-pages from @ nlmixr2/nonmem2rx@88548065178d2e31ad8081d72a06d14f1f1f6885 🚀
</commit_message>
<xml_diff>
--- a/articles/mod-Word.docx
+++ b/articles/mod-Word.docx
@@ -67,7 +67,7 @@
         </w:rPr>
         <w:t xml:space="preserve">Figure </w:t>
       </w:r>
-      <w:bookmarkStart w:id="463f75c4-a578-4eb6-974d-84b8ac7509f6" w:name="model_diagram"/>
+      <w:bookmarkStart w:id="fb0c10cb-3e1a-4d4b-9f38-0716e009cf44" w:name="model_diagram"/>
       <w:r>
         <w:rPr/>
         <w:t xml:space="preserve"/>
@@ -88,7 +88,7 @@
         <w:rPr/>
         <w:t xml:space="preserve"/>
       </w:r>
-      <w:bookmarkEnd w:id="463f75c4-a578-4eb6-974d-84b8ac7509f6"/>
+      <w:bookmarkEnd w:id="fb0c10cb-3e1a-4d4b-9f38-0716e009cf44"/>
       <w:r>
         <w:rPr>
           <w:rFonts/>
@@ -1266,7 +1266,7 @@
         </w:rPr>
         <w:t xml:space="preserve">Table </w:t>
       </w:r>
-      <w:bookmarkStart w:id="58de222c-05b7-4e88-b368-2bcbdbb76924" w:name="model_equations"/>
+      <w:bookmarkStart w:id="64e55d6c-523d-4a35-97d2-768bfc21eff2" w:name="model_equations"/>
       <w:r>
         <w:rPr/>
         <w:t xml:space="preserve"/>
@@ -1287,7 +1287,7 @@
         <w:rPr/>
         <w:t xml:space="preserve"/>
       </w:r>
-      <w:bookmarkEnd w:id="58de222c-05b7-4e88-b368-2bcbdbb76924"/>
+      <w:bookmarkEnd w:id="64e55d6c-523d-4a35-97d2-768bfc21eff2"/>
       <w:r>
         <w:rPr>
           <w:rFonts/>
@@ -3685,7 +3685,7 @@
         </w:rPr>
         <w:t xml:space="preserve">Table </w:t>
       </w:r>
-      <w:bookmarkStart w:id="9a14ee95-83cd-4b26-90d0-777203e521a4" w:name="pest_table"/>
+      <w:bookmarkStart w:id="3b39a64a-1f31-42fc-942f-1ab4c4fb0134" w:name="pest_table"/>
       <w:r>
         <w:rPr/>
         <w:t xml:space="preserve"/>
@@ -3706,7 +3706,7 @@
         <w:rPr/>
         <w:t xml:space="preserve"/>
       </w:r>
-      <w:bookmarkEnd w:id="9a14ee95-83cd-4b26-90d0-777203e521a4"/>
+      <w:bookmarkEnd w:id="3b39a64a-1f31-42fc-942f-1ab4c4fb0134"/>
       <w:r>
         <w:rPr>
           <w:rFonts/>
@@ -3802,7 +3802,7 @@
         </w:rPr>
         <w:t xml:space="preserve">Figure </w:t>
       </w:r>
-      <w:bookmarkStart w:id="69e7298a-f3d9-4d3c-94e4-40b1b5325440" w:name="ind_plots"/>
+      <w:bookmarkStart w:id="ee28617b-0df8-44e7-ac7f-5171de036bd9" w:name="ind_plots"/>
       <w:r>
         <w:rPr/>
         <w:t xml:space="preserve"/>
@@ -3823,7 +3823,7 @@
         <w:rPr/>
         <w:t xml:space="preserve"/>
       </w:r>
-      <w:bookmarkEnd w:id="69e7298a-f3d9-4d3c-94e4-40b1b5325440"/>
+      <w:bookmarkEnd w:id="ee28617b-0df8-44e7-ac7f-5171de036bd9"/>
       <w:r>
         <w:rPr>
           <w:rFonts/>
@@ -4706,7 +4706,7 @@
         </w:rPr>
         <w:t xml:space="preserve">Figure </w:t>
       </w:r>
-      <w:bookmarkStart w:id="971e550e-f0cd-433a-9969-68840efc0d6a" w:name="dv_vs_pred_ipred"/>
+      <w:bookmarkStart w:id="7a181e51-d1b9-4a73-a90b-f38106168c9b" w:name="dv_vs_pred_ipred"/>
       <w:r>
         <w:rPr/>
         <w:t xml:space="preserve"/>
@@ -4727,7 +4727,7 @@
         <w:rPr/>
         <w:t xml:space="preserve"/>
       </w:r>
-      <w:bookmarkEnd w:id="971e550e-f0cd-433a-9969-68840efc0d6a"/>
+      <w:bookmarkEnd w:id="7a181e51-d1b9-4a73-a90b-f38106168c9b"/>
       <w:r>
         <w:rPr>
           <w:rFonts/>
@@ -4815,7 +4815,7 @@
         </w:rPr>
         <w:t xml:space="preserve">Figure </w:t>
       </w:r>
-      <w:bookmarkStart w:id="6ba85d9a-3592-4c82-afc6-ebec183558aa" w:name="prm_vs_iteration"/>
+      <w:bookmarkStart w:id="6a815f6f-3e1f-4967-ab77-729632604963" w:name="prm_vs_iteration"/>
       <w:r>
         <w:rPr/>
         <w:t xml:space="preserve"/>
@@ -4836,7 +4836,7 @@
         <w:rPr/>
         <w:t xml:space="preserve"/>
       </w:r>
-      <w:bookmarkEnd w:id="6ba85d9a-3592-4c82-afc6-ebec183558aa"/>
+      <w:bookmarkEnd w:id="6a815f6f-3e1f-4967-ab77-729632604963"/>
       <w:r>
         <w:rPr>
           <w:rFonts/>

</xml_diff>

<commit_message>
Deploying to gh-pages from @ nlmixr2/nonmem2rx@273fb2398f0c3cfb290a6b220cd1cf97cf1ab33b 🚀
</commit_message>
<xml_diff>
--- a/articles/mod-Word.docx
+++ b/articles/mod-Word.docx
@@ -67,7 +67,7 @@
         </w:rPr>
         <w:t xml:space="preserve">Figure </w:t>
       </w:r>
-      <w:bookmarkStart w:id="fb0c10cb-3e1a-4d4b-9f38-0716e009cf44" w:name="model_diagram"/>
+      <w:bookmarkStart w:id="565c1b8c-3602-4396-958f-235a6c04a3cb" w:name="model_diagram"/>
       <w:r>
         <w:rPr/>
         <w:t xml:space="preserve"/>
@@ -88,7 +88,7 @@
         <w:rPr/>
         <w:t xml:space="preserve"/>
       </w:r>
-      <w:bookmarkEnd w:id="fb0c10cb-3e1a-4d4b-9f38-0716e009cf44"/>
+      <w:bookmarkEnd w:id="565c1b8c-3602-4396-958f-235a6c04a3cb"/>
       <w:r>
         <w:rPr>
           <w:rFonts/>
@@ -1266,7 +1266,7 @@
         </w:rPr>
         <w:t xml:space="preserve">Table </w:t>
       </w:r>
-      <w:bookmarkStart w:id="64e55d6c-523d-4a35-97d2-768bfc21eff2" w:name="model_equations"/>
+      <w:bookmarkStart w:id="df8e48fc-bc03-40d4-9ed4-5ad1c4e6b3df" w:name="model_equations"/>
       <w:r>
         <w:rPr/>
         <w:t xml:space="preserve"/>
@@ -1287,7 +1287,7 @@
         <w:rPr/>
         <w:t xml:space="preserve"/>
       </w:r>
-      <w:bookmarkEnd w:id="64e55d6c-523d-4a35-97d2-768bfc21eff2"/>
+      <w:bookmarkEnd w:id="df8e48fc-bc03-40d4-9ed4-5ad1c4e6b3df"/>
       <w:r>
         <w:rPr>
           <w:rFonts/>
@@ -3685,7 +3685,7 @@
         </w:rPr>
         <w:t xml:space="preserve">Table </w:t>
       </w:r>
-      <w:bookmarkStart w:id="3b39a64a-1f31-42fc-942f-1ab4c4fb0134" w:name="pest_table"/>
+      <w:bookmarkStart w:id="8d5617b4-df4e-4df5-ae4c-a052030f1f57" w:name="pest_table"/>
       <w:r>
         <w:rPr/>
         <w:t xml:space="preserve"/>
@@ -3706,7 +3706,7 @@
         <w:rPr/>
         <w:t xml:space="preserve"/>
       </w:r>
-      <w:bookmarkEnd w:id="3b39a64a-1f31-42fc-942f-1ab4c4fb0134"/>
+      <w:bookmarkEnd w:id="8d5617b4-df4e-4df5-ae4c-a052030f1f57"/>
       <w:r>
         <w:rPr>
           <w:rFonts/>
@@ -3802,7 +3802,7 @@
         </w:rPr>
         <w:t xml:space="preserve">Figure </w:t>
       </w:r>
-      <w:bookmarkStart w:id="ee28617b-0df8-44e7-ac7f-5171de036bd9" w:name="ind_plots"/>
+      <w:bookmarkStart w:id="9d567dc1-32e6-4ea9-b5c0-30253b66c25f" w:name="ind_plots"/>
       <w:r>
         <w:rPr/>
         <w:t xml:space="preserve"/>
@@ -3823,7 +3823,7 @@
         <w:rPr/>
         <w:t xml:space="preserve"/>
       </w:r>
-      <w:bookmarkEnd w:id="ee28617b-0df8-44e7-ac7f-5171de036bd9"/>
+      <w:bookmarkEnd w:id="9d567dc1-32e6-4ea9-b5c0-30253b66c25f"/>
       <w:r>
         <w:rPr>
           <w:rFonts/>
@@ -4706,7 +4706,7 @@
         </w:rPr>
         <w:t xml:space="preserve">Figure </w:t>
       </w:r>
-      <w:bookmarkStart w:id="7a181e51-d1b9-4a73-a90b-f38106168c9b" w:name="dv_vs_pred_ipred"/>
+      <w:bookmarkStart w:id="6e8c488c-206b-42ce-96f9-8c618b60d97d" w:name="dv_vs_pred_ipred"/>
       <w:r>
         <w:rPr/>
         <w:t xml:space="preserve"/>
@@ -4727,7 +4727,7 @@
         <w:rPr/>
         <w:t xml:space="preserve"/>
       </w:r>
-      <w:bookmarkEnd w:id="7a181e51-d1b9-4a73-a90b-f38106168c9b"/>
+      <w:bookmarkEnd w:id="6e8c488c-206b-42ce-96f9-8c618b60d97d"/>
       <w:r>
         <w:rPr>
           <w:rFonts/>
@@ -4815,7 +4815,7 @@
         </w:rPr>
         <w:t xml:space="preserve">Figure </w:t>
       </w:r>
-      <w:bookmarkStart w:id="6a815f6f-3e1f-4967-ab77-729632604963" w:name="prm_vs_iteration"/>
+      <w:bookmarkStart w:id="d191e5fa-100b-446a-af1f-585ff6f4597f" w:name="prm_vs_iteration"/>
       <w:r>
         <w:rPr/>
         <w:t xml:space="preserve"/>
@@ -4836,7 +4836,7 @@
         <w:rPr/>
         <w:t xml:space="preserve"/>
       </w:r>
-      <w:bookmarkEnd w:id="6a815f6f-3e1f-4967-ab77-729632604963"/>
+      <w:bookmarkEnd w:id="d191e5fa-100b-446a-af1f-585ff6f4597f"/>
       <w:r>
         <w:rPr>
           <w:rFonts/>

</xml_diff>

<commit_message>
Deploying to gh-pages from @ nlmixr2/nonmem2rx@d9ed41c7bffe7641c1d9e450c800fbf76743427c 🚀
</commit_message>
<xml_diff>
--- a/articles/mod-Word.docx
+++ b/articles/mod-Word.docx
@@ -67,7 +67,7 @@
         </w:rPr>
         <w:t xml:space="preserve">Figure </w:t>
       </w:r>
-      <w:bookmarkStart w:id="565c1b8c-3602-4396-958f-235a6c04a3cb" w:name="model_diagram"/>
+      <w:bookmarkStart w:id="bf199a63-9238-4a91-ac37-0d546ae5cb6c" w:name="model_diagram"/>
       <w:r>
         <w:rPr/>
         <w:t xml:space="preserve"/>
@@ -88,7 +88,7 @@
         <w:rPr/>
         <w:t xml:space="preserve"/>
       </w:r>
-      <w:bookmarkEnd w:id="565c1b8c-3602-4396-958f-235a6c04a3cb"/>
+      <w:bookmarkEnd w:id="bf199a63-9238-4a91-ac37-0d546ae5cb6c"/>
       <w:r>
         <w:rPr>
           <w:rFonts/>
@@ -1266,7 +1266,7 @@
         </w:rPr>
         <w:t xml:space="preserve">Table </w:t>
       </w:r>
-      <w:bookmarkStart w:id="df8e48fc-bc03-40d4-9ed4-5ad1c4e6b3df" w:name="model_equations"/>
+      <w:bookmarkStart w:id="46f80c03-d381-4fa7-abae-eebcfe826ce6" w:name="model_equations"/>
       <w:r>
         <w:rPr/>
         <w:t xml:space="preserve"/>
@@ -1287,7 +1287,7 @@
         <w:rPr/>
         <w:t xml:space="preserve"/>
       </w:r>
-      <w:bookmarkEnd w:id="df8e48fc-bc03-40d4-9ed4-5ad1c4e6b3df"/>
+      <w:bookmarkEnd w:id="46f80c03-d381-4fa7-abae-eebcfe826ce6"/>
       <w:r>
         <w:rPr>
           <w:rFonts/>
@@ -3685,7 +3685,7 @@
         </w:rPr>
         <w:t xml:space="preserve">Table </w:t>
       </w:r>
-      <w:bookmarkStart w:id="8d5617b4-df4e-4df5-ae4c-a052030f1f57" w:name="pest_table"/>
+      <w:bookmarkStart w:id="edcb422b-d346-4705-a4ca-802771989b65" w:name="pest_table"/>
       <w:r>
         <w:rPr/>
         <w:t xml:space="preserve"/>
@@ -3706,7 +3706,7 @@
         <w:rPr/>
         <w:t xml:space="preserve"/>
       </w:r>
-      <w:bookmarkEnd w:id="8d5617b4-df4e-4df5-ae4c-a052030f1f57"/>
+      <w:bookmarkEnd w:id="edcb422b-d346-4705-a4ca-802771989b65"/>
       <w:r>
         <w:rPr>
           <w:rFonts/>
@@ -3802,7 +3802,7 @@
         </w:rPr>
         <w:t xml:space="preserve">Figure </w:t>
       </w:r>
-      <w:bookmarkStart w:id="9d567dc1-32e6-4ea9-b5c0-30253b66c25f" w:name="ind_plots"/>
+      <w:bookmarkStart w:id="767afeea-398c-4bc5-8c8f-4c4c64e8a096" w:name="ind_plots"/>
       <w:r>
         <w:rPr/>
         <w:t xml:space="preserve"/>
@@ -3823,7 +3823,7 @@
         <w:rPr/>
         <w:t xml:space="preserve"/>
       </w:r>
-      <w:bookmarkEnd w:id="9d567dc1-32e6-4ea9-b5c0-30253b66c25f"/>
+      <w:bookmarkEnd w:id="767afeea-398c-4bc5-8c8f-4c4c64e8a096"/>
       <w:r>
         <w:rPr>
           <w:rFonts/>
@@ -4706,7 +4706,7 @@
         </w:rPr>
         <w:t xml:space="preserve">Figure </w:t>
       </w:r>
-      <w:bookmarkStart w:id="6e8c488c-206b-42ce-96f9-8c618b60d97d" w:name="dv_vs_pred_ipred"/>
+      <w:bookmarkStart w:id="6beb5439-2b67-4eff-a2e7-0561f45143b4" w:name="dv_vs_pred_ipred"/>
       <w:r>
         <w:rPr/>
         <w:t xml:space="preserve"/>
@@ -4727,7 +4727,7 @@
         <w:rPr/>
         <w:t xml:space="preserve"/>
       </w:r>
-      <w:bookmarkEnd w:id="6e8c488c-206b-42ce-96f9-8c618b60d97d"/>
+      <w:bookmarkEnd w:id="6beb5439-2b67-4eff-a2e7-0561f45143b4"/>
       <w:r>
         <w:rPr>
           <w:rFonts/>
@@ -4815,7 +4815,7 @@
         </w:rPr>
         <w:t xml:space="preserve">Figure </w:t>
       </w:r>
-      <w:bookmarkStart w:id="d191e5fa-100b-446a-af1f-585ff6f4597f" w:name="prm_vs_iteration"/>
+      <w:bookmarkStart w:id="1883c5e4-aae1-42b1-b174-cc5eba832a8d" w:name="prm_vs_iteration"/>
       <w:r>
         <w:rPr/>
         <w:t xml:space="preserve"/>
@@ -4836,7 +4836,7 @@
         <w:rPr/>
         <w:t xml:space="preserve"/>
       </w:r>
-      <w:bookmarkEnd w:id="d191e5fa-100b-446a-af1f-585ff6f4597f"/>
+      <w:bookmarkEnd w:id="1883c5e4-aae1-42b1-b174-cc5eba832a8d"/>
       <w:r>
         <w:rPr>
           <w:rFonts/>

</xml_diff>

<commit_message>
Deploying to gh-pages from @ nlmixr2/nonmem2rx@ba601004c6bddd1727cb4cea3d6dfab5c099359d 🚀
</commit_message>
<xml_diff>
--- a/articles/mod-Word.docx
+++ b/articles/mod-Word.docx
@@ -67,7 +67,7 @@
         </w:rPr>
         <w:t xml:space="preserve">Figure </w:t>
       </w:r>
-      <w:bookmarkStart w:id="bf199a63-9238-4a91-ac37-0d546ae5cb6c" w:name="model_diagram"/>
+      <w:bookmarkStart w:id="b78d6233-1282-4f1e-890e-e2bd6fbfddc1" w:name="model_diagram"/>
       <w:r>
         <w:rPr/>
         <w:t xml:space="preserve"/>
@@ -88,7 +88,7 @@
         <w:rPr/>
         <w:t xml:space="preserve"/>
       </w:r>
-      <w:bookmarkEnd w:id="bf199a63-9238-4a91-ac37-0d546ae5cb6c"/>
+      <w:bookmarkEnd w:id="b78d6233-1282-4f1e-890e-e2bd6fbfddc1"/>
       <w:r>
         <w:rPr>
           <w:rFonts/>
@@ -1266,7 +1266,7 @@
         </w:rPr>
         <w:t xml:space="preserve">Table </w:t>
       </w:r>
-      <w:bookmarkStart w:id="46f80c03-d381-4fa7-abae-eebcfe826ce6" w:name="model_equations"/>
+      <w:bookmarkStart w:id="c2cec1b9-b92c-4055-8a05-fc39efe744b2" w:name="model_equations"/>
       <w:r>
         <w:rPr/>
         <w:t xml:space="preserve"/>
@@ -1287,7 +1287,7 @@
         <w:rPr/>
         <w:t xml:space="preserve"/>
       </w:r>
-      <w:bookmarkEnd w:id="46f80c03-d381-4fa7-abae-eebcfe826ce6"/>
+      <w:bookmarkEnd w:id="c2cec1b9-b92c-4055-8a05-fc39efe744b2"/>
       <w:r>
         <w:rPr>
           <w:rFonts/>
@@ -3685,7 +3685,7 @@
         </w:rPr>
         <w:t xml:space="preserve">Table </w:t>
       </w:r>
-      <w:bookmarkStart w:id="edcb422b-d346-4705-a4ca-802771989b65" w:name="pest_table"/>
+      <w:bookmarkStart w:id="7b20b559-d08f-4ecd-8e49-b1b2033505cd" w:name="pest_table"/>
       <w:r>
         <w:rPr/>
         <w:t xml:space="preserve"/>
@@ -3706,7 +3706,7 @@
         <w:rPr/>
         <w:t xml:space="preserve"/>
       </w:r>
-      <w:bookmarkEnd w:id="edcb422b-d346-4705-a4ca-802771989b65"/>
+      <w:bookmarkEnd w:id="7b20b559-d08f-4ecd-8e49-b1b2033505cd"/>
       <w:r>
         <w:rPr>
           <w:rFonts/>
@@ -3802,7 +3802,7 @@
         </w:rPr>
         <w:t xml:space="preserve">Figure </w:t>
       </w:r>
-      <w:bookmarkStart w:id="767afeea-398c-4bc5-8c8f-4c4c64e8a096" w:name="ind_plots"/>
+      <w:bookmarkStart w:id="23134b3f-b404-4b96-9929-5752aa8fb97a" w:name="ind_plots"/>
       <w:r>
         <w:rPr/>
         <w:t xml:space="preserve"/>
@@ -3823,7 +3823,7 @@
         <w:rPr/>
         <w:t xml:space="preserve"/>
       </w:r>
-      <w:bookmarkEnd w:id="767afeea-398c-4bc5-8c8f-4c4c64e8a096"/>
+      <w:bookmarkEnd w:id="23134b3f-b404-4b96-9929-5752aa8fb97a"/>
       <w:r>
         <w:rPr>
           <w:rFonts/>
@@ -4706,7 +4706,7 @@
         </w:rPr>
         <w:t xml:space="preserve">Figure </w:t>
       </w:r>
-      <w:bookmarkStart w:id="6beb5439-2b67-4eff-a2e7-0561f45143b4" w:name="dv_vs_pred_ipred"/>
+      <w:bookmarkStart w:id="22c8e943-6eb3-4c0f-9232-c8418f876dcc" w:name="dv_vs_pred_ipred"/>
       <w:r>
         <w:rPr/>
         <w:t xml:space="preserve"/>
@@ -4727,7 +4727,7 @@
         <w:rPr/>
         <w:t xml:space="preserve"/>
       </w:r>
-      <w:bookmarkEnd w:id="6beb5439-2b67-4eff-a2e7-0561f45143b4"/>
+      <w:bookmarkEnd w:id="22c8e943-6eb3-4c0f-9232-c8418f876dcc"/>
       <w:r>
         <w:rPr>
           <w:rFonts/>
@@ -4815,7 +4815,7 @@
         </w:rPr>
         <w:t xml:space="preserve">Figure </w:t>
       </w:r>
-      <w:bookmarkStart w:id="1883c5e4-aae1-42b1-b174-cc5eba832a8d" w:name="prm_vs_iteration"/>
+      <w:bookmarkStart w:id="23e798eb-5675-45b4-a8a0-32589e4e281e" w:name="prm_vs_iteration"/>
       <w:r>
         <w:rPr/>
         <w:t xml:space="preserve"/>
@@ -4836,7 +4836,7 @@
         <w:rPr/>
         <w:t xml:space="preserve"/>
       </w:r>
-      <w:bookmarkEnd w:id="1883c5e4-aae1-42b1-b174-cc5eba832a8d"/>
+      <w:bookmarkEnd w:id="23e798eb-5675-45b4-a8a0-32589e4e281e"/>
       <w:r>
         <w:rPr>
           <w:rFonts/>

</xml_diff>

<commit_message>
Deploying to gh-pages from @ nlmixr2/nonmem2rx@972a74a907a529fcb0bf0d82c82f3cc1b412df30 🚀
</commit_message>
<xml_diff>
--- a/articles/mod-Word.docx
+++ b/articles/mod-Word.docx
@@ -67,7 +67,7 @@
         </w:rPr>
         <w:t xml:space="preserve">Figure </w:t>
       </w:r>
-      <w:bookmarkStart w:id="b78d6233-1282-4f1e-890e-e2bd6fbfddc1" w:name="model_diagram"/>
+      <w:bookmarkStart w:id="38acbeb1-7541-47fc-800e-7192ee0be596" w:name="model_diagram"/>
       <w:r>
         <w:rPr/>
         <w:t xml:space="preserve"/>
@@ -88,7 +88,7 @@
         <w:rPr/>
         <w:t xml:space="preserve"/>
       </w:r>
-      <w:bookmarkEnd w:id="b78d6233-1282-4f1e-890e-e2bd6fbfddc1"/>
+      <w:bookmarkEnd w:id="38acbeb1-7541-47fc-800e-7192ee0be596"/>
       <w:r>
         <w:rPr>
           <w:rFonts/>
@@ -1266,7 +1266,7 @@
         </w:rPr>
         <w:t xml:space="preserve">Table </w:t>
       </w:r>
-      <w:bookmarkStart w:id="c2cec1b9-b92c-4055-8a05-fc39efe744b2" w:name="model_equations"/>
+      <w:bookmarkStart w:id="985a5dbd-5cba-4e6f-b01a-af36a0cf2df2" w:name="model_equations"/>
       <w:r>
         <w:rPr/>
         <w:t xml:space="preserve"/>
@@ -1287,7 +1287,7 @@
         <w:rPr/>
         <w:t xml:space="preserve"/>
       </w:r>
-      <w:bookmarkEnd w:id="c2cec1b9-b92c-4055-8a05-fc39efe744b2"/>
+      <w:bookmarkEnd w:id="985a5dbd-5cba-4e6f-b01a-af36a0cf2df2"/>
       <w:r>
         <w:rPr>
           <w:rFonts/>
@@ -3685,7 +3685,7 @@
         </w:rPr>
         <w:t xml:space="preserve">Table </w:t>
       </w:r>
-      <w:bookmarkStart w:id="7b20b559-d08f-4ecd-8e49-b1b2033505cd" w:name="pest_table"/>
+      <w:bookmarkStart w:id="6e3f369e-0afc-45fe-a382-dc6b9638b995" w:name="pest_table"/>
       <w:r>
         <w:rPr/>
         <w:t xml:space="preserve"/>
@@ -3706,7 +3706,7 @@
         <w:rPr/>
         <w:t xml:space="preserve"/>
       </w:r>
-      <w:bookmarkEnd w:id="7b20b559-d08f-4ecd-8e49-b1b2033505cd"/>
+      <w:bookmarkEnd w:id="6e3f369e-0afc-45fe-a382-dc6b9638b995"/>
       <w:r>
         <w:rPr>
           <w:rFonts/>
@@ -3802,7 +3802,7 @@
         </w:rPr>
         <w:t xml:space="preserve">Figure </w:t>
       </w:r>
-      <w:bookmarkStart w:id="23134b3f-b404-4b96-9929-5752aa8fb97a" w:name="ind_plots"/>
+      <w:bookmarkStart w:id="036a292c-4338-4d34-98a3-6e0f7a9d7154" w:name="ind_plots"/>
       <w:r>
         <w:rPr/>
         <w:t xml:space="preserve"/>
@@ -3823,7 +3823,7 @@
         <w:rPr/>
         <w:t xml:space="preserve"/>
       </w:r>
-      <w:bookmarkEnd w:id="23134b3f-b404-4b96-9929-5752aa8fb97a"/>
+      <w:bookmarkEnd w:id="036a292c-4338-4d34-98a3-6e0f7a9d7154"/>
       <w:r>
         <w:rPr>
           <w:rFonts/>
@@ -4706,7 +4706,7 @@
         </w:rPr>
         <w:t xml:space="preserve">Figure </w:t>
       </w:r>
-      <w:bookmarkStart w:id="22c8e943-6eb3-4c0f-9232-c8418f876dcc" w:name="dv_vs_pred_ipred"/>
+      <w:bookmarkStart w:id="9fb64bc0-151f-43a2-8a23-23a5e579940c" w:name="dv_vs_pred_ipred"/>
       <w:r>
         <w:rPr/>
         <w:t xml:space="preserve"/>
@@ -4727,7 +4727,7 @@
         <w:rPr/>
         <w:t xml:space="preserve"/>
       </w:r>
-      <w:bookmarkEnd w:id="22c8e943-6eb3-4c0f-9232-c8418f876dcc"/>
+      <w:bookmarkEnd w:id="9fb64bc0-151f-43a2-8a23-23a5e579940c"/>
       <w:r>
         <w:rPr>
           <w:rFonts/>
@@ -4815,7 +4815,7 @@
         </w:rPr>
         <w:t xml:space="preserve">Figure </w:t>
       </w:r>
-      <w:bookmarkStart w:id="23e798eb-5675-45b4-a8a0-32589e4e281e" w:name="prm_vs_iteration"/>
+      <w:bookmarkStart w:id="9e52935f-4465-4ec8-92f5-d040b9eaf39d" w:name="prm_vs_iteration"/>
       <w:r>
         <w:rPr/>
         <w:t xml:space="preserve"/>
@@ -4836,7 +4836,7 @@
         <w:rPr/>
         <w:t xml:space="preserve"/>
       </w:r>
-      <w:bookmarkEnd w:id="23e798eb-5675-45b4-a8a0-32589e4e281e"/>
+      <w:bookmarkEnd w:id="9e52935f-4465-4ec8-92f5-d040b9eaf39d"/>
       <w:r>
         <w:rPr>
           <w:rFonts/>

</xml_diff>

<commit_message>
Deploying to gh-pages from @ nlmixr2/nonmem2rx@d119dab548822eee912607d6cc51ceefdae26bc3 🚀
</commit_message>
<xml_diff>
--- a/articles/mod-Word.docx
+++ b/articles/mod-Word.docx
@@ -67,7 +67,7 @@
         </w:rPr>
         <w:t xml:space="preserve">Figure </w:t>
       </w:r>
-      <w:bookmarkStart w:id="38acbeb1-7541-47fc-800e-7192ee0be596" w:name="model_diagram"/>
+      <w:bookmarkStart w:id="667ead8d-76ce-474e-8979-6fd93162acdc" w:name="model_diagram"/>
       <w:r>
         <w:rPr/>
         <w:t xml:space="preserve"/>
@@ -88,7 +88,7 @@
         <w:rPr/>
         <w:t xml:space="preserve"/>
       </w:r>
-      <w:bookmarkEnd w:id="38acbeb1-7541-47fc-800e-7192ee0be596"/>
+      <w:bookmarkEnd w:id="667ead8d-76ce-474e-8979-6fd93162acdc"/>
       <w:r>
         <w:rPr>
           <w:rFonts/>
@@ -1266,7 +1266,7 @@
         </w:rPr>
         <w:t xml:space="preserve">Table </w:t>
       </w:r>
-      <w:bookmarkStart w:id="985a5dbd-5cba-4e6f-b01a-af36a0cf2df2" w:name="model_equations"/>
+      <w:bookmarkStart w:id="1be29f97-a4bf-48e9-8804-38282c02cb35" w:name="model_equations"/>
       <w:r>
         <w:rPr/>
         <w:t xml:space="preserve"/>
@@ -1287,7 +1287,7 @@
         <w:rPr/>
         <w:t xml:space="preserve"/>
       </w:r>
-      <w:bookmarkEnd w:id="985a5dbd-5cba-4e6f-b01a-af36a0cf2df2"/>
+      <w:bookmarkEnd w:id="1be29f97-a4bf-48e9-8804-38282c02cb35"/>
       <w:r>
         <w:rPr>
           <w:rFonts/>
@@ -3685,7 +3685,7 @@
         </w:rPr>
         <w:t xml:space="preserve">Table </w:t>
       </w:r>
-      <w:bookmarkStart w:id="6e3f369e-0afc-45fe-a382-dc6b9638b995" w:name="pest_table"/>
+      <w:bookmarkStart w:id="bdd0da31-8b09-4772-8bb0-d90a32eb8c8e" w:name="pest_table"/>
       <w:r>
         <w:rPr/>
         <w:t xml:space="preserve"/>
@@ -3706,7 +3706,7 @@
         <w:rPr/>
         <w:t xml:space="preserve"/>
       </w:r>
-      <w:bookmarkEnd w:id="6e3f369e-0afc-45fe-a382-dc6b9638b995"/>
+      <w:bookmarkEnd w:id="bdd0da31-8b09-4772-8bb0-d90a32eb8c8e"/>
       <w:r>
         <w:rPr>
           <w:rFonts/>
@@ -3802,7 +3802,7 @@
         </w:rPr>
         <w:t xml:space="preserve">Figure </w:t>
       </w:r>
-      <w:bookmarkStart w:id="036a292c-4338-4d34-98a3-6e0f7a9d7154" w:name="ind_plots"/>
+      <w:bookmarkStart w:id="cda41285-b6aa-4ced-9ec4-5d498696d418" w:name="ind_plots"/>
       <w:r>
         <w:rPr/>
         <w:t xml:space="preserve"/>
@@ -3823,7 +3823,7 @@
         <w:rPr/>
         <w:t xml:space="preserve"/>
       </w:r>
-      <w:bookmarkEnd w:id="036a292c-4338-4d34-98a3-6e0f7a9d7154"/>
+      <w:bookmarkEnd w:id="cda41285-b6aa-4ced-9ec4-5d498696d418"/>
       <w:r>
         <w:rPr>
           <w:rFonts/>
@@ -4706,7 +4706,7 @@
         </w:rPr>
         <w:t xml:space="preserve">Figure </w:t>
       </w:r>
-      <w:bookmarkStart w:id="9fb64bc0-151f-43a2-8a23-23a5e579940c" w:name="dv_vs_pred_ipred"/>
+      <w:bookmarkStart w:id="cf2dede6-0d8e-4cac-8f75-24da9c909845" w:name="dv_vs_pred_ipred"/>
       <w:r>
         <w:rPr/>
         <w:t xml:space="preserve"/>
@@ -4727,7 +4727,7 @@
         <w:rPr/>
         <w:t xml:space="preserve"/>
       </w:r>
-      <w:bookmarkEnd w:id="9fb64bc0-151f-43a2-8a23-23a5e579940c"/>
+      <w:bookmarkEnd w:id="cf2dede6-0d8e-4cac-8f75-24da9c909845"/>
       <w:r>
         <w:rPr>
           <w:rFonts/>
@@ -4815,7 +4815,7 @@
         </w:rPr>
         <w:t xml:space="preserve">Figure </w:t>
       </w:r>
-      <w:bookmarkStart w:id="9e52935f-4465-4ec8-92f5-d040b9eaf39d" w:name="prm_vs_iteration"/>
+      <w:bookmarkStart w:id="65e7e68e-3bfc-42b1-a0bc-50f9d34ec6e4" w:name="prm_vs_iteration"/>
       <w:r>
         <w:rPr/>
         <w:t xml:space="preserve"/>
@@ -4836,7 +4836,7 @@
         <w:rPr/>
         <w:t xml:space="preserve"/>
       </w:r>
-      <w:bookmarkEnd w:id="9e52935f-4465-4ec8-92f5-d040b9eaf39d"/>
+      <w:bookmarkEnd w:id="65e7e68e-3bfc-42b1-a0bc-50f9d34ec6e4"/>
       <w:r>
         <w:rPr>
           <w:rFonts/>

</xml_diff>

<commit_message>
Deploying to gh-pages from @ nlmixr2/nonmem2rx@c9b90fe692112270916639c5468b76ffee2e4e5e 🚀
</commit_message>
<xml_diff>
--- a/articles/mod-Word.docx
+++ b/articles/mod-Word.docx
@@ -67,7 +67,7 @@
         </w:rPr>
         <w:t xml:space="preserve">Figure </w:t>
       </w:r>
-      <w:bookmarkStart w:id="667ead8d-76ce-474e-8979-6fd93162acdc" w:name="model_diagram"/>
+      <w:bookmarkStart w:id="4f6eed4c-019b-42d9-9f3d-d9a78119595f" w:name="model_diagram"/>
       <w:r>
         <w:rPr/>
         <w:t xml:space="preserve"/>
@@ -88,7 +88,7 @@
         <w:rPr/>
         <w:t xml:space="preserve"/>
       </w:r>
-      <w:bookmarkEnd w:id="667ead8d-76ce-474e-8979-6fd93162acdc"/>
+      <w:bookmarkEnd w:id="4f6eed4c-019b-42d9-9f3d-d9a78119595f"/>
       <w:r>
         <w:rPr>
           <w:rFonts/>
@@ -1266,7 +1266,7 @@
         </w:rPr>
         <w:t xml:space="preserve">Table </w:t>
       </w:r>
-      <w:bookmarkStart w:id="1be29f97-a4bf-48e9-8804-38282c02cb35" w:name="model_equations"/>
+      <w:bookmarkStart w:id="f4eda503-8292-4a07-a684-f5273c43c05d" w:name="model_equations"/>
       <w:r>
         <w:rPr/>
         <w:t xml:space="preserve"/>
@@ -1287,7 +1287,7 @@
         <w:rPr/>
         <w:t xml:space="preserve"/>
       </w:r>
-      <w:bookmarkEnd w:id="1be29f97-a4bf-48e9-8804-38282c02cb35"/>
+      <w:bookmarkEnd w:id="f4eda503-8292-4a07-a684-f5273c43c05d"/>
       <w:r>
         <w:rPr>
           <w:rFonts/>
@@ -3685,7 +3685,7 @@
         </w:rPr>
         <w:t xml:space="preserve">Table </w:t>
       </w:r>
-      <w:bookmarkStart w:id="bdd0da31-8b09-4772-8bb0-d90a32eb8c8e" w:name="pest_table"/>
+      <w:bookmarkStart w:id="9d53c0ac-8ff1-49e8-83f0-e8754612d97f" w:name="pest_table"/>
       <w:r>
         <w:rPr/>
         <w:t xml:space="preserve"/>
@@ -3706,7 +3706,7 @@
         <w:rPr/>
         <w:t xml:space="preserve"/>
       </w:r>
-      <w:bookmarkEnd w:id="bdd0da31-8b09-4772-8bb0-d90a32eb8c8e"/>
+      <w:bookmarkEnd w:id="9d53c0ac-8ff1-49e8-83f0-e8754612d97f"/>
       <w:r>
         <w:rPr>
           <w:rFonts/>
@@ -3802,7 +3802,7 @@
         </w:rPr>
         <w:t xml:space="preserve">Figure </w:t>
       </w:r>
-      <w:bookmarkStart w:id="cda41285-b6aa-4ced-9ec4-5d498696d418" w:name="ind_plots"/>
+      <w:bookmarkStart w:id="25a5e7bc-4639-4a67-9931-7f72418831e7" w:name="ind_plots"/>
       <w:r>
         <w:rPr/>
         <w:t xml:space="preserve"/>
@@ -3823,7 +3823,7 @@
         <w:rPr/>
         <w:t xml:space="preserve"/>
       </w:r>
-      <w:bookmarkEnd w:id="cda41285-b6aa-4ced-9ec4-5d498696d418"/>
+      <w:bookmarkEnd w:id="25a5e7bc-4639-4a67-9931-7f72418831e7"/>
       <w:r>
         <w:rPr>
           <w:rFonts/>
@@ -4706,7 +4706,7 @@
         </w:rPr>
         <w:t xml:space="preserve">Figure </w:t>
       </w:r>
-      <w:bookmarkStart w:id="cf2dede6-0d8e-4cac-8f75-24da9c909845" w:name="dv_vs_pred_ipred"/>
+      <w:bookmarkStart w:id="3e232a4a-8403-4b38-bd55-2ac6024c0570" w:name="dv_vs_pred_ipred"/>
       <w:r>
         <w:rPr/>
         <w:t xml:space="preserve"/>
@@ -4727,7 +4727,7 @@
         <w:rPr/>
         <w:t xml:space="preserve"/>
       </w:r>
-      <w:bookmarkEnd w:id="cf2dede6-0d8e-4cac-8f75-24da9c909845"/>
+      <w:bookmarkEnd w:id="3e232a4a-8403-4b38-bd55-2ac6024c0570"/>
       <w:r>
         <w:rPr>
           <w:rFonts/>
@@ -4815,7 +4815,7 @@
         </w:rPr>
         <w:t xml:space="preserve">Figure </w:t>
       </w:r>
-      <w:bookmarkStart w:id="65e7e68e-3bfc-42b1-a0bc-50f9d34ec6e4" w:name="prm_vs_iteration"/>
+      <w:bookmarkStart w:id="bc723986-f52b-4059-836f-c6942cd65fe9" w:name="prm_vs_iteration"/>
       <w:r>
         <w:rPr/>
         <w:t xml:space="preserve"/>
@@ -4836,7 +4836,7 @@
         <w:rPr/>
         <w:t xml:space="preserve"/>
       </w:r>
-      <w:bookmarkEnd w:id="65e7e68e-3bfc-42b1-a0bc-50f9d34ec6e4"/>
+      <w:bookmarkEnd w:id="bc723986-f52b-4059-836f-c6942cd65fe9"/>
       <w:r>
         <w:rPr>
           <w:rFonts/>

</xml_diff>

<commit_message>
Deploying to gh-pages from @ nlmixr2/nonmem2rx@9867e33d06d0d5c9f2d730c7680394e9d3d3e094 🚀
</commit_message>
<xml_diff>
--- a/articles/mod-Word.docx
+++ b/articles/mod-Word.docx
@@ -67,7 +67,7 @@
         </w:rPr>
         <w:t xml:space="preserve">Figure </w:t>
       </w:r>
-      <w:bookmarkStart w:id="4f6eed4c-019b-42d9-9f3d-d9a78119595f" w:name="model_diagram"/>
+      <w:bookmarkStart w:id="654e37ca-c2e9-4a58-b8c5-d1b9ea5c8426" w:name="model_diagram"/>
       <w:r>
         <w:rPr/>
         <w:t xml:space="preserve"/>
@@ -88,7 +88,7 @@
         <w:rPr/>
         <w:t xml:space="preserve"/>
       </w:r>
-      <w:bookmarkEnd w:id="4f6eed4c-019b-42d9-9f3d-d9a78119595f"/>
+      <w:bookmarkEnd w:id="654e37ca-c2e9-4a58-b8c5-d1b9ea5c8426"/>
       <w:r>
         <w:rPr>
           <w:rFonts/>
@@ -1266,7 +1266,7 @@
         </w:rPr>
         <w:t xml:space="preserve">Table </w:t>
       </w:r>
-      <w:bookmarkStart w:id="f4eda503-8292-4a07-a684-f5273c43c05d" w:name="model_equations"/>
+      <w:bookmarkStart w:id="4114bfbc-a0d1-49a5-b28b-2c824c0a12c8" w:name="model_equations"/>
       <w:r>
         <w:rPr/>
         <w:t xml:space="preserve"/>
@@ -1287,7 +1287,7 @@
         <w:rPr/>
         <w:t xml:space="preserve"/>
       </w:r>
-      <w:bookmarkEnd w:id="f4eda503-8292-4a07-a684-f5273c43c05d"/>
+      <w:bookmarkEnd w:id="4114bfbc-a0d1-49a5-b28b-2c824c0a12c8"/>
       <w:r>
         <w:rPr>
           <w:rFonts/>
@@ -3685,7 +3685,7 @@
         </w:rPr>
         <w:t xml:space="preserve">Table </w:t>
       </w:r>
-      <w:bookmarkStart w:id="9d53c0ac-8ff1-49e8-83f0-e8754612d97f" w:name="pest_table"/>
+      <w:bookmarkStart w:id="30d4a8e8-a597-4850-9359-9b1977c4c6a7" w:name="pest_table"/>
       <w:r>
         <w:rPr/>
         <w:t xml:space="preserve"/>
@@ -3706,7 +3706,7 @@
         <w:rPr/>
         <w:t xml:space="preserve"/>
       </w:r>
-      <w:bookmarkEnd w:id="9d53c0ac-8ff1-49e8-83f0-e8754612d97f"/>
+      <w:bookmarkEnd w:id="30d4a8e8-a597-4850-9359-9b1977c4c6a7"/>
       <w:r>
         <w:rPr>
           <w:rFonts/>
@@ -3802,7 +3802,7 @@
         </w:rPr>
         <w:t xml:space="preserve">Figure </w:t>
       </w:r>
-      <w:bookmarkStart w:id="25a5e7bc-4639-4a67-9931-7f72418831e7" w:name="ind_plots"/>
+      <w:bookmarkStart w:id="75618d35-0829-4455-9a3d-46afdf5f58bc" w:name="ind_plots"/>
       <w:r>
         <w:rPr/>
         <w:t xml:space="preserve"/>
@@ -3823,7 +3823,7 @@
         <w:rPr/>
         <w:t xml:space="preserve"/>
       </w:r>
-      <w:bookmarkEnd w:id="25a5e7bc-4639-4a67-9931-7f72418831e7"/>
+      <w:bookmarkEnd w:id="75618d35-0829-4455-9a3d-46afdf5f58bc"/>
       <w:r>
         <w:rPr>
           <w:rFonts/>
@@ -4706,7 +4706,7 @@
         </w:rPr>
         <w:t xml:space="preserve">Figure </w:t>
       </w:r>
-      <w:bookmarkStart w:id="3e232a4a-8403-4b38-bd55-2ac6024c0570" w:name="dv_vs_pred_ipred"/>
+      <w:bookmarkStart w:id="5dab1db7-03dd-481c-98c0-2166e0aa0e53" w:name="dv_vs_pred_ipred"/>
       <w:r>
         <w:rPr/>
         <w:t xml:space="preserve"/>
@@ -4727,7 +4727,7 @@
         <w:rPr/>
         <w:t xml:space="preserve"/>
       </w:r>
-      <w:bookmarkEnd w:id="3e232a4a-8403-4b38-bd55-2ac6024c0570"/>
+      <w:bookmarkEnd w:id="5dab1db7-03dd-481c-98c0-2166e0aa0e53"/>
       <w:r>
         <w:rPr>
           <w:rFonts/>
@@ -4815,7 +4815,7 @@
         </w:rPr>
         <w:t xml:space="preserve">Figure </w:t>
       </w:r>
-      <w:bookmarkStart w:id="bc723986-f52b-4059-836f-c6942cd65fe9" w:name="prm_vs_iteration"/>
+      <w:bookmarkStart w:id="3cfe8966-58fd-4ff8-b45f-f2c83efdd661" w:name="prm_vs_iteration"/>
       <w:r>
         <w:rPr/>
         <w:t xml:space="preserve"/>
@@ -4836,7 +4836,7 @@
         <w:rPr/>
         <w:t xml:space="preserve"/>
       </w:r>
-      <w:bookmarkEnd w:id="bc723986-f52b-4059-836f-c6942cd65fe9"/>
+      <w:bookmarkEnd w:id="3cfe8966-58fd-4ff8-b45f-f2c83efdd661"/>
       <w:r>
         <w:rPr>
           <w:rFonts/>

</xml_diff>

<commit_message>
Deploying to gh-pages from @ nlmixr2/nonmem2rx@16b3a82444abe2a83fecf6856e69d028a93973a6 🚀
</commit_message>
<xml_diff>
--- a/articles/mod-Word.docx
+++ b/articles/mod-Word.docx
@@ -67,7 +67,7 @@
         </w:rPr>
         <w:t xml:space="preserve">Figure </w:t>
       </w:r>
-      <w:bookmarkStart w:id="654e37ca-c2e9-4a58-b8c5-d1b9ea5c8426" w:name="model_diagram"/>
+      <w:bookmarkStart w:id="9054781d-7d02-4a8d-9a3b-8034db962735" w:name="model_diagram"/>
       <w:r>
         <w:rPr/>
         <w:t xml:space="preserve"/>
@@ -88,7 +88,7 @@
         <w:rPr/>
         <w:t xml:space="preserve"/>
       </w:r>
-      <w:bookmarkEnd w:id="654e37ca-c2e9-4a58-b8c5-d1b9ea5c8426"/>
+      <w:bookmarkEnd w:id="9054781d-7d02-4a8d-9a3b-8034db962735"/>
       <w:r>
         <w:rPr>
           <w:rFonts/>
@@ -1266,7 +1266,7 @@
         </w:rPr>
         <w:t xml:space="preserve">Table </w:t>
       </w:r>
-      <w:bookmarkStart w:id="4114bfbc-a0d1-49a5-b28b-2c824c0a12c8" w:name="model_equations"/>
+      <w:bookmarkStart w:id="60888673-da1b-4ed8-afe0-4fcf1010fd3a" w:name="model_equations"/>
       <w:r>
         <w:rPr/>
         <w:t xml:space="preserve"/>
@@ -1287,7 +1287,7 @@
         <w:rPr/>
         <w:t xml:space="preserve"/>
       </w:r>
-      <w:bookmarkEnd w:id="4114bfbc-a0d1-49a5-b28b-2c824c0a12c8"/>
+      <w:bookmarkEnd w:id="60888673-da1b-4ed8-afe0-4fcf1010fd3a"/>
       <w:r>
         <w:rPr>
           <w:rFonts/>
@@ -3685,7 +3685,7 @@
         </w:rPr>
         <w:t xml:space="preserve">Table </w:t>
       </w:r>
-      <w:bookmarkStart w:id="30d4a8e8-a597-4850-9359-9b1977c4c6a7" w:name="pest_table"/>
+      <w:bookmarkStart w:id="920746b3-3fb4-4593-99f3-0f938b2dc503" w:name="pest_table"/>
       <w:r>
         <w:rPr/>
         <w:t xml:space="preserve"/>
@@ -3706,7 +3706,7 @@
         <w:rPr/>
         <w:t xml:space="preserve"/>
       </w:r>
-      <w:bookmarkEnd w:id="30d4a8e8-a597-4850-9359-9b1977c4c6a7"/>
+      <w:bookmarkEnd w:id="920746b3-3fb4-4593-99f3-0f938b2dc503"/>
       <w:r>
         <w:rPr>
           <w:rFonts/>
@@ -3802,7 +3802,7 @@
         </w:rPr>
         <w:t xml:space="preserve">Figure </w:t>
       </w:r>
-      <w:bookmarkStart w:id="75618d35-0829-4455-9a3d-46afdf5f58bc" w:name="ind_plots"/>
+      <w:bookmarkStart w:id="82a00b99-55a9-40da-ab0f-7e8c1ba9c2ef" w:name="ind_plots"/>
       <w:r>
         <w:rPr/>
         <w:t xml:space="preserve"/>
@@ -3823,7 +3823,7 @@
         <w:rPr/>
         <w:t xml:space="preserve"/>
       </w:r>
-      <w:bookmarkEnd w:id="75618d35-0829-4455-9a3d-46afdf5f58bc"/>
+      <w:bookmarkEnd w:id="82a00b99-55a9-40da-ab0f-7e8c1ba9c2ef"/>
       <w:r>
         <w:rPr>
           <w:rFonts/>
@@ -4706,7 +4706,7 @@
         </w:rPr>
         <w:t xml:space="preserve">Figure </w:t>
       </w:r>
-      <w:bookmarkStart w:id="5dab1db7-03dd-481c-98c0-2166e0aa0e53" w:name="dv_vs_pred_ipred"/>
+      <w:bookmarkStart w:id="127bdc57-3cff-40f4-a5b4-d5c3e68b56e6" w:name="dv_vs_pred_ipred"/>
       <w:r>
         <w:rPr/>
         <w:t xml:space="preserve"/>
@@ -4727,7 +4727,7 @@
         <w:rPr/>
         <w:t xml:space="preserve"/>
       </w:r>
-      <w:bookmarkEnd w:id="5dab1db7-03dd-481c-98c0-2166e0aa0e53"/>
+      <w:bookmarkEnd w:id="127bdc57-3cff-40f4-a5b4-d5c3e68b56e6"/>
       <w:r>
         <w:rPr>
           <w:rFonts/>
@@ -4815,7 +4815,7 @@
         </w:rPr>
         <w:t xml:space="preserve">Figure </w:t>
       </w:r>
-      <w:bookmarkStart w:id="3cfe8966-58fd-4ff8-b45f-f2c83efdd661" w:name="prm_vs_iteration"/>
+      <w:bookmarkStart w:id="bf7cc343-c750-453e-a204-fb80ce6d778d" w:name="prm_vs_iteration"/>
       <w:r>
         <w:rPr/>
         <w:t xml:space="preserve"/>
@@ -4836,7 +4836,7 @@
         <w:rPr/>
         <w:t xml:space="preserve"/>
       </w:r>
-      <w:bookmarkEnd w:id="3cfe8966-58fd-4ff8-b45f-f2c83efdd661"/>
+      <w:bookmarkEnd w:id="bf7cc343-c750-453e-a204-fb80ce6d778d"/>
       <w:r>
         <w:rPr>
           <w:rFonts/>

</xml_diff>

<commit_message>
Deploying to gh-pages from @ nlmixr2/nonmem2rx@74a195f05b8e8e9ba3f77eb085f60a56e683eb2d 🚀
</commit_message>
<xml_diff>
--- a/articles/mod-Word.docx
+++ b/articles/mod-Word.docx
@@ -67,7 +67,7 @@
         </w:rPr>
         <w:t xml:space="preserve">Figure </w:t>
       </w:r>
-      <w:bookmarkStart w:id="9054781d-7d02-4a8d-9a3b-8034db962735" w:name="model_diagram"/>
+      <w:bookmarkStart w:id="c0369472-c9f7-4220-9c33-b467e0de0ce1" w:name="model_diagram"/>
       <w:r>
         <w:rPr/>
         <w:t xml:space="preserve"/>
@@ -88,7 +88,7 @@
         <w:rPr/>
         <w:t xml:space="preserve"/>
       </w:r>
-      <w:bookmarkEnd w:id="9054781d-7d02-4a8d-9a3b-8034db962735"/>
+      <w:bookmarkEnd w:id="c0369472-c9f7-4220-9c33-b467e0de0ce1"/>
       <w:r>
         <w:rPr>
           <w:rFonts/>
@@ -1266,7 +1266,7 @@
         </w:rPr>
         <w:t xml:space="preserve">Table </w:t>
       </w:r>
-      <w:bookmarkStart w:id="60888673-da1b-4ed8-afe0-4fcf1010fd3a" w:name="model_equations"/>
+      <w:bookmarkStart w:id="6a66ad9a-755f-492a-bcf0-25288a61caff" w:name="model_equations"/>
       <w:r>
         <w:rPr/>
         <w:t xml:space="preserve"/>
@@ -1287,7 +1287,7 @@
         <w:rPr/>
         <w:t xml:space="preserve"/>
       </w:r>
-      <w:bookmarkEnd w:id="60888673-da1b-4ed8-afe0-4fcf1010fd3a"/>
+      <w:bookmarkEnd w:id="6a66ad9a-755f-492a-bcf0-25288a61caff"/>
       <w:r>
         <w:rPr>
           <w:rFonts/>
@@ -3685,7 +3685,7 @@
         </w:rPr>
         <w:t xml:space="preserve">Table </w:t>
       </w:r>
-      <w:bookmarkStart w:id="920746b3-3fb4-4593-99f3-0f938b2dc503" w:name="pest_table"/>
+      <w:bookmarkStart w:id="a4ef2169-ef8a-4f43-bf92-1e20da7084f5" w:name="pest_table"/>
       <w:r>
         <w:rPr/>
         <w:t xml:space="preserve"/>
@@ -3706,7 +3706,7 @@
         <w:rPr/>
         <w:t xml:space="preserve"/>
       </w:r>
-      <w:bookmarkEnd w:id="920746b3-3fb4-4593-99f3-0f938b2dc503"/>
+      <w:bookmarkEnd w:id="a4ef2169-ef8a-4f43-bf92-1e20da7084f5"/>
       <w:r>
         <w:rPr>
           <w:rFonts/>
@@ -3802,7 +3802,7 @@
         </w:rPr>
         <w:t xml:space="preserve">Figure </w:t>
       </w:r>
-      <w:bookmarkStart w:id="82a00b99-55a9-40da-ab0f-7e8c1ba9c2ef" w:name="ind_plots"/>
+      <w:bookmarkStart w:id="e1e4004d-a66f-444a-b167-0289eb7dbe16" w:name="ind_plots"/>
       <w:r>
         <w:rPr/>
         <w:t xml:space="preserve"/>
@@ -3823,7 +3823,7 @@
         <w:rPr/>
         <w:t xml:space="preserve"/>
       </w:r>
-      <w:bookmarkEnd w:id="82a00b99-55a9-40da-ab0f-7e8c1ba9c2ef"/>
+      <w:bookmarkEnd w:id="e1e4004d-a66f-444a-b167-0289eb7dbe16"/>
       <w:r>
         <w:rPr>
           <w:rFonts/>
@@ -4706,7 +4706,7 @@
         </w:rPr>
         <w:t xml:space="preserve">Figure </w:t>
       </w:r>
-      <w:bookmarkStart w:id="127bdc57-3cff-40f4-a5b4-d5c3e68b56e6" w:name="dv_vs_pred_ipred"/>
+      <w:bookmarkStart w:id="71708e36-c196-4c10-8be1-7293a8cce3aa" w:name="dv_vs_pred_ipred"/>
       <w:r>
         <w:rPr/>
         <w:t xml:space="preserve"/>
@@ -4727,7 +4727,7 @@
         <w:rPr/>
         <w:t xml:space="preserve"/>
       </w:r>
-      <w:bookmarkEnd w:id="127bdc57-3cff-40f4-a5b4-d5c3e68b56e6"/>
+      <w:bookmarkEnd w:id="71708e36-c196-4c10-8be1-7293a8cce3aa"/>
       <w:r>
         <w:rPr>
           <w:rFonts/>
@@ -4815,7 +4815,7 @@
         </w:rPr>
         <w:t xml:space="preserve">Figure </w:t>
       </w:r>
-      <w:bookmarkStart w:id="bf7cc343-c750-453e-a204-fb80ce6d778d" w:name="prm_vs_iteration"/>
+      <w:bookmarkStart w:id="418c4632-5c27-459f-8167-8d3e692ae3d4" w:name="prm_vs_iteration"/>
       <w:r>
         <w:rPr/>
         <w:t xml:space="preserve"/>
@@ -4836,7 +4836,7 @@
         <w:rPr/>
         <w:t xml:space="preserve"/>
       </w:r>
-      <w:bookmarkEnd w:id="bf7cc343-c750-453e-a204-fb80ce6d778d"/>
+      <w:bookmarkEnd w:id="418c4632-5c27-459f-8167-8d3e692ae3d4"/>
       <w:r>
         <w:rPr>
           <w:rFonts/>

</xml_diff>

<commit_message>
Deploying to gh-pages from @ nlmixr2/nonmem2rx@c8d66c13ec731920f5d7d6a655793cfc4e85449d 🚀
</commit_message>
<xml_diff>
--- a/articles/mod-Word.docx
+++ b/articles/mod-Word.docx
@@ -67,7 +67,7 @@
         </w:rPr>
         <w:t xml:space="preserve">Figure </w:t>
       </w:r>
-      <w:bookmarkStart w:id="c0369472-c9f7-4220-9c33-b467e0de0ce1" w:name="model_diagram"/>
+      <w:bookmarkStart w:id="28a3070f-5675-4e30-ac78-813882dd4072" w:name="model_diagram"/>
       <w:r>
         <w:rPr/>
         <w:t xml:space="preserve"/>
@@ -88,7 +88,7 @@
         <w:rPr/>
         <w:t xml:space="preserve"/>
       </w:r>
-      <w:bookmarkEnd w:id="c0369472-c9f7-4220-9c33-b467e0de0ce1"/>
+      <w:bookmarkEnd w:id="28a3070f-5675-4e30-ac78-813882dd4072"/>
       <w:r>
         <w:rPr>
           <w:rFonts/>
@@ -1266,7 +1266,7 @@
         </w:rPr>
         <w:t xml:space="preserve">Table </w:t>
       </w:r>
-      <w:bookmarkStart w:id="6a66ad9a-755f-492a-bcf0-25288a61caff" w:name="model_equations"/>
+      <w:bookmarkStart w:id="a368a00a-e327-41da-9c99-6abc2925957f" w:name="model_equations"/>
       <w:r>
         <w:rPr/>
         <w:t xml:space="preserve"/>
@@ -1287,7 +1287,7 @@
         <w:rPr/>
         <w:t xml:space="preserve"/>
       </w:r>
-      <w:bookmarkEnd w:id="6a66ad9a-755f-492a-bcf0-25288a61caff"/>
+      <w:bookmarkEnd w:id="a368a00a-e327-41da-9c99-6abc2925957f"/>
       <w:r>
         <w:rPr>
           <w:rFonts/>
@@ -3685,7 +3685,7 @@
         </w:rPr>
         <w:t xml:space="preserve">Table </w:t>
       </w:r>
-      <w:bookmarkStart w:id="a4ef2169-ef8a-4f43-bf92-1e20da7084f5" w:name="pest_table"/>
+      <w:bookmarkStart w:id="d870c0ef-cf4f-44a6-9e78-81283379af55" w:name="pest_table"/>
       <w:r>
         <w:rPr/>
         <w:t xml:space="preserve"/>
@@ -3706,7 +3706,7 @@
         <w:rPr/>
         <w:t xml:space="preserve"/>
       </w:r>
-      <w:bookmarkEnd w:id="a4ef2169-ef8a-4f43-bf92-1e20da7084f5"/>
+      <w:bookmarkEnd w:id="d870c0ef-cf4f-44a6-9e78-81283379af55"/>
       <w:r>
         <w:rPr>
           <w:rFonts/>
@@ -3802,7 +3802,7 @@
         </w:rPr>
         <w:t xml:space="preserve">Figure </w:t>
       </w:r>
-      <w:bookmarkStart w:id="e1e4004d-a66f-444a-b167-0289eb7dbe16" w:name="ind_plots"/>
+      <w:bookmarkStart w:id="f562512b-edb2-4541-bad6-3bcafe7101f7" w:name="ind_plots"/>
       <w:r>
         <w:rPr/>
         <w:t xml:space="preserve"/>
@@ -3823,7 +3823,7 @@
         <w:rPr/>
         <w:t xml:space="preserve"/>
       </w:r>
-      <w:bookmarkEnd w:id="e1e4004d-a66f-444a-b167-0289eb7dbe16"/>
+      <w:bookmarkEnd w:id="f562512b-edb2-4541-bad6-3bcafe7101f7"/>
       <w:r>
         <w:rPr>
           <w:rFonts/>
@@ -4706,7 +4706,7 @@
         </w:rPr>
         <w:t xml:space="preserve">Figure </w:t>
       </w:r>
-      <w:bookmarkStart w:id="71708e36-c196-4c10-8be1-7293a8cce3aa" w:name="dv_vs_pred_ipred"/>
+      <w:bookmarkStart w:id="737809ae-2e12-4d1d-8ff6-f3fe4090bb5b" w:name="dv_vs_pred_ipred"/>
       <w:r>
         <w:rPr/>
         <w:t xml:space="preserve"/>
@@ -4727,7 +4727,7 @@
         <w:rPr/>
         <w:t xml:space="preserve"/>
       </w:r>
-      <w:bookmarkEnd w:id="71708e36-c196-4c10-8be1-7293a8cce3aa"/>
+      <w:bookmarkEnd w:id="737809ae-2e12-4d1d-8ff6-f3fe4090bb5b"/>
       <w:r>
         <w:rPr>
           <w:rFonts/>
@@ -4815,7 +4815,7 @@
         </w:rPr>
         <w:t xml:space="preserve">Figure </w:t>
       </w:r>
-      <w:bookmarkStart w:id="418c4632-5c27-459f-8167-8d3e692ae3d4" w:name="prm_vs_iteration"/>
+      <w:bookmarkStart w:id="96cab4ce-a33d-4250-8719-1c6c68ef6cac" w:name="prm_vs_iteration"/>
       <w:r>
         <w:rPr/>
         <w:t xml:space="preserve"/>
@@ -4836,7 +4836,7 @@
         <w:rPr/>
         <w:t xml:space="preserve"/>
       </w:r>
-      <w:bookmarkEnd w:id="418c4632-5c27-459f-8167-8d3e692ae3d4"/>
+      <w:bookmarkEnd w:id="96cab4ce-a33d-4250-8719-1c6c68ef6cac"/>
       <w:r>
         <w:rPr>
           <w:rFonts/>

</xml_diff>

<commit_message>
Deploying to gh-pages from @ nlmixr2/nonmem2rx@257e3510736bc5aa0b3389eaa441d3be77cc4550 🚀
</commit_message>
<xml_diff>
--- a/articles/mod-Word.docx
+++ b/articles/mod-Word.docx
@@ -67,7 +67,7 @@
         </w:rPr>
         <w:t xml:space="preserve">Figure </w:t>
       </w:r>
-      <w:bookmarkStart w:id="28a3070f-5675-4e30-ac78-813882dd4072" w:name="model_diagram"/>
+      <w:bookmarkStart w:id="5d51edcc-6251-498e-8dc0-831a11bde510" w:name="model_diagram"/>
       <w:r>
         <w:rPr/>
         <w:t xml:space="preserve"/>
@@ -88,7 +88,7 @@
         <w:rPr/>
         <w:t xml:space="preserve"/>
       </w:r>
-      <w:bookmarkEnd w:id="28a3070f-5675-4e30-ac78-813882dd4072"/>
+      <w:bookmarkEnd w:id="5d51edcc-6251-498e-8dc0-831a11bde510"/>
       <w:r>
         <w:rPr>
           <w:rFonts/>
@@ -1266,7 +1266,7 @@
         </w:rPr>
         <w:t xml:space="preserve">Table </w:t>
       </w:r>
-      <w:bookmarkStart w:id="a368a00a-e327-41da-9c99-6abc2925957f" w:name="model_equations"/>
+      <w:bookmarkStart w:id="74cac69a-f1d5-449a-b755-e461a936f492" w:name="model_equations"/>
       <w:r>
         <w:rPr/>
         <w:t xml:space="preserve"/>
@@ -1287,7 +1287,7 @@
         <w:rPr/>
         <w:t xml:space="preserve"/>
       </w:r>
-      <w:bookmarkEnd w:id="a368a00a-e327-41da-9c99-6abc2925957f"/>
+      <w:bookmarkEnd w:id="74cac69a-f1d5-449a-b755-e461a936f492"/>
       <w:r>
         <w:rPr>
           <w:rFonts/>
@@ -3685,7 +3685,7 @@
         </w:rPr>
         <w:t xml:space="preserve">Table </w:t>
       </w:r>
-      <w:bookmarkStart w:id="d870c0ef-cf4f-44a6-9e78-81283379af55" w:name="pest_table"/>
+      <w:bookmarkStart w:id="70d5357b-93e3-4aa9-a29b-bf4e17fc0740" w:name="pest_table"/>
       <w:r>
         <w:rPr/>
         <w:t xml:space="preserve"/>
@@ -3706,7 +3706,7 @@
         <w:rPr/>
         <w:t xml:space="preserve"/>
       </w:r>
-      <w:bookmarkEnd w:id="d870c0ef-cf4f-44a6-9e78-81283379af55"/>
+      <w:bookmarkEnd w:id="70d5357b-93e3-4aa9-a29b-bf4e17fc0740"/>
       <w:r>
         <w:rPr>
           <w:rFonts/>
@@ -3802,7 +3802,7 @@
         </w:rPr>
         <w:t xml:space="preserve">Figure </w:t>
       </w:r>
-      <w:bookmarkStart w:id="f562512b-edb2-4541-bad6-3bcafe7101f7" w:name="ind_plots"/>
+      <w:bookmarkStart w:id="a3f52401-29b6-4ea6-9bb3-237df3997a58" w:name="ind_plots"/>
       <w:r>
         <w:rPr/>
         <w:t xml:space="preserve"/>
@@ -3823,7 +3823,7 @@
         <w:rPr/>
         <w:t xml:space="preserve"/>
       </w:r>
-      <w:bookmarkEnd w:id="f562512b-edb2-4541-bad6-3bcafe7101f7"/>
+      <w:bookmarkEnd w:id="a3f52401-29b6-4ea6-9bb3-237df3997a58"/>
       <w:r>
         <w:rPr>
           <w:rFonts/>
@@ -4706,7 +4706,7 @@
         </w:rPr>
         <w:t xml:space="preserve">Figure </w:t>
       </w:r>
-      <w:bookmarkStart w:id="737809ae-2e12-4d1d-8ff6-f3fe4090bb5b" w:name="dv_vs_pred_ipred"/>
+      <w:bookmarkStart w:id="e8bcbb87-3f4b-49a5-a521-1ba9d6af6d79" w:name="dv_vs_pred_ipred"/>
       <w:r>
         <w:rPr/>
         <w:t xml:space="preserve"/>
@@ -4727,7 +4727,7 @@
         <w:rPr/>
         <w:t xml:space="preserve"/>
       </w:r>
-      <w:bookmarkEnd w:id="737809ae-2e12-4d1d-8ff6-f3fe4090bb5b"/>
+      <w:bookmarkEnd w:id="e8bcbb87-3f4b-49a5-a521-1ba9d6af6d79"/>
       <w:r>
         <w:rPr>
           <w:rFonts/>
@@ -4815,7 +4815,7 @@
         </w:rPr>
         <w:t xml:space="preserve">Figure </w:t>
       </w:r>
-      <w:bookmarkStart w:id="96cab4ce-a33d-4250-8719-1c6c68ef6cac" w:name="prm_vs_iteration"/>
+      <w:bookmarkStart w:id="d151eab6-da76-41ee-8c91-be394f955571" w:name="prm_vs_iteration"/>
       <w:r>
         <w:rPr/>
         <w:t xml:space="preserve"/>
@@ -4836,7 +4836,7 @@
         <w:rPr/>
         <w:t xml:space="preserve"/>
       </w:r>
-      <w:bookmarkEnd w:id="96cab4ce-a33d-4250-8719-1c6c68ef6cac"/>
+      <w:bookmarkEnd w:id="d151eab6-da76-41ee-8c91-be394f955571"/>
       <w:r>
         <w:rPr>
           <w:rFonts/>

</xml_diff>

<commit_message>
Deploying to gh-pages from @ nlmixr2/nonmem2rx@320c88cd3d5875ea77da6d622a89c8176133187e 🚀
</commit_message>
<xml_diff>
--- a/articles/mod-Word.docx
+++ b/articles/mod-Word.docx
@@ -67,7 +67,7 @@
         </w:rPr>
         <w:t xml:space="preserve">Figure </w:t>
       </w:r>
-      <w:bookmarkStart w:id="5d51edcc-6251-498e-8dc0-831a11bde510" w:name="model_diagram"/>
+      <w:bookmarkStart w:id="1a59f37b-2b1e-4aa5-be58-000e8ac19c23" w:name="model_diagram"/>
       <w:r>
         <w:rPr/>
         <w:t xml:space="preserve"/>
@@ -88,7 +88,7 @@
         <w:rPr/>
         <w:t xml:space="preserve"/>
       </w:r>
-      <w:bookmarkEnd w:id="5d51edcc-6251-498e-8dc0-831a11bde510"/>
+      <w:bookmarkEnd w:id="1a59f37b-2b1e-4aa5-be58-000e8ac19c23"/>
       <w:r>
         <w:rPr>
           <w:rFonts/>
@@ -1266,7 +1266,7 @@
         </w:rPr>
         <w:t xml:space="preserve">Table </w:t>
       </w:r>
-      <w:bookmarkStart w:id="74cac69a-f1d5-449a-b755-e461a936f492" w:name="model_equations"/>
+      <w:bookmarkStart w:id="2b13dc2d-fa9e-43f8-9ae8-e6b7f923c07a" w:name="model_equations"/>
       <w:r>
         <w:rPr/>
         <w:t xml:space="preserve"/>
@@ -1287,7 +1287,7 @@
         <w:rPr/>
         <w:t xml:space="preserve"/>
       </w:r>
-      <w:bookmarkEnd w:id="74cac69a-f1d5-449a-b755-e461a936f492"/>
+      <w:bookmarkEnd w:id="2b13dc2d-fa9e-43f8-9ae8-e6b7f923c07a"/>
       <w:r>
         <w:rPr>
           <w:rFonts/>
@@ -3685,7 +3685,7 @@
         </w:rPr>
         <w:t xml:space="preserve">Table </w:t>
       </w:r>
-      <w:bookmarkStart w:id="70d5357b-93e3-4aa9-a29b-bf4e17fc0740" w:name="pest_table"/>
+      <w:bookmarkStart w:id="b3ab2feb-6ae0-4aa0-b293-332ee7b175ff" w:name="pest_table"/>
       <w:r>
         <w:rPr/>
         <w:t xml:space="preserve"/>
@@ -3706,7 +3706,7 @@
         <w:rPr/>
         <w:t xml:space="preserve"/>
       </w:r>
-      <w:bookmarkEnd w:id="70d5357b-93e3-4aa9-a29b-bf4e17fc0740"/>
+      <w:bookmarkEnd w:id="b3ab2feb-6ae0-4aa0-b293-332ee7b175ff"/>
       <w:r>
         <w:rPr>
           <w:rFonts/>
@@ -3802,7 +3802,7 @@
         </w:rPr>
         <w:t xml:space="preserve">Figure </w:t>
       </w:r>
-      <w:bookmarkStart w:id="a3f52401-29b6-4ea6-9bb3-237df3997a58" w:name="ind_plots"/>
+      <w:bookmarkStart w:id="90d8535c-afba-481b-af4e-d333ac8c23c1" w:name="ind_plots"/>
       <w:r>
         <w:rPr/>
         <w:t xml:space="preserve"/>
@@ -3823,7 +3823,7 @@
         <w:rPr/>
         <w:t xml:space="preserve"/>
       </w:r>
-      <w:bookmarkEnd w:id="a3f52401-29b6-4ea6-9bb3-237df3997a58"/>
+      <w:bookmarkEnd w:id="90d8535c-afba-481b-af4e-d333ac8c23c1"/>
       <w:r>
         <w:rPr>
           <w:rFonts/>
@@ -4706,7 +4706,7 @@
         </w:rPr>
         <w:t xml:space="preserve">Figure </w:t>
       </w:r>
-      <w:bookmarkStart w:id="e8bcbb87-3f4b-49a5-a521-1ba9d6af6d79" w:name="dv_vs_pred_ipred"/>
+      <w:bookmarkStart w:id="bf705d46-bea4-4b07-a391-b77f23d23246" w:name="dv_vs_pred_ipred"/>
       <w:r>
         <w:rPr/>
         <w:t xml:space="preserve"/>
@@ -4727,7 +4727,7 @@
         <w:rPr/>
         <w:t xml:space="preserve"/>
       </w:r>
-      <w:bookmarkEnd w:id="e8bcbb87-3f4b-49a5-a521-1ba9d6af6d79"/>
+      <w:bookmarkEnd w:id="bf705d46-bea4-4b07-a391-b77f23d23246"/>
       <w:r>
         <w:rPr>
           <w:rFonts/>
@@ -4815,7 +4815,7 @@
         </w:rPr>
         <w:t xml:space="preserve">Figure </w:t>
       </w:r>
-      <w:bookmarkStart w:id="d151eab6-da76-41ee-8c91-be394f955571" w:name="prm_vs_iteration"/>
+      <w:bookmarkStart w:id="732f25e3-f430-4879-8801-21e95f084ca6" w:name="prm_vs_iteration"/>
       <w:r>
         <w:rPr/>
         <w:t xml:space="preserve"/>
@@ -4836,7 +4836,7 @@
         <w:rPr/>
         <w:t xml:space="preserve"/>
       </w:r>
-      <w:bookmarkEnd w:id="d151eab6-da76-41ee-8c91-be394f955571"/>
+      <w:bookmarkEnd w:id="732f25e3-f430-4879-8801-21e95f084ca6"/>
       <w:r>
         <w:rPr>
           <w:rFonts/>

</xml_diff>

<commit_message>
Deploying to gh-pages from @ nlmixr2/nonmem2rx@96c04b98e91296fe92321b0a32b01d109432593d 🚀
</commit_message>
<xml_diff>
--- a/articles/mod-Word.docx
+++ b/articles/mod-Word.docx
@@ -67,7 +67,7 @@
         </w:rPr>
         <w:t xml:space="preserve">Figure </w:t>
       </w:r>
-      <w:bookmarkStart w:id="1a59f37b-2b1e-4aa5-be58-000e8ac19c23" w:name="model_diagram"/>
+      <w:bookmarkStart w:id="af7947fd-a9b7-47fc-b49d-ed7bcbb055d1" w:name="model_diagram"/>
       <w:r>
         <w:rPr/>
         <w:t xml:space="preserve"/>
@@ -88,7 +88,7 @@
         <w:rPr/>
         <w:t xml:space="preserve"/>
       </w:r>
-      <w:bookmarkEnd w:id="1a59f37b-2b1e-4aa5-be58-000e8ac19c23"/>
+      <w:bookmarkEnd w:id="af7947fd-a9b7-47fc-b49d-ed7bcbb055d1"/>
       <w:r>
         <w:rPr>
           <w:rFonts/>
@@ -1266,7 +1266,7 @@
         </w:rPr>
         <w:t xml:space="preserve">Table </w:t>
       </w:r>
-      <w:bookmarkStart w:id="2b13dc2d-fa9e-43f8-9ae8-e6b7f923c07a" w:name="model_equations"/>
+      <w:bookmarkStart w:id="1d189f79-dbe2-4278-871e-63907c9b1d69" w:name="model_equations"/>
       <w:r>
         <w:rPr/>
         <w:t xml:space="preserve"/>
@@ -1287,7 +1287,7 @@
         <w:rPr/>
         <w:t xml:space="preserve"/>
       </w:r>
-      <w:bookmarkEnd w:id="2b13dc2d-fa9e-43f8-9ae8-e6b7f923c07a"/>
+      <w:bookmarkEnd w:id="1d189f79-dbe2-4278-871e-63907c9b1d69"/>
       <w:r>
         <w:rPr>
           <w:rFonts/>
@@ -3685,7 +3685,7 @@
         </w:rPr>
         <w:t xml:space="preserve">Table </w:t>
       </w:r>
-      <w:bookmarkStart w:id="b3ab2feb-6ae0-4aa0-b293-332ee7b175ff" w:name="pest_table"/>
+      <w:bookmarkStart w:id="1ac4a85a-03f0-47fb-9a4f-04f6766cc961" w:name="pest_table"/>
       <w:r>
         <w:rPr/>
         <w:t xml:space="preserve"/>
@@ -3706,7 +3706,7 @@
         <w:rPr/>
         <w:t xml:space="preserve"/>
       </w:r>
-      <w:bookmarkEnd w:id="b3ab2feb-6ae0-4aa0-b293-332ee7b175ff"/>
+      <w:bookmarkEnd w:id="1ac4a85a-03f0-47fb-9a4f-04f6766cc961"/>
       <w:r>
         <w:rPr>
           <w:rFonts/>
@@ -3802,7 +3802,7 @@
         </w:rPr>
         <w:t xml:space="preserve">Figure </w:t>
       </w:r>
-      <w:bookmarkStart w:id="90d8535c-afba-481b-af4e-d333ac8c23c1" w:name="ind_plots"/>
+      <w:bookmarkStart w:id="e6d463d1-846f-482b-9a58-3a551fb42e82" w:name="ind_plots"/>
       <w:r>
         <w:rPr/>
         <w:t xml:space="preserve"/>
@@ -3823,7 +3823,7 @@
         <w:rPr/>
         <w:t xml:space="preserve"/>
       </w:r>
-      <w:bookmarkEnd w:id="90d8535c-afba-481b-af4e-d333ac8c23c1"/>
+      <w:bookmarkEnd w:id="e6d463d1-846f-482b-9a58-3a551fb42e82"/>
       <w:r>
         <w:rPr>
           <w:rFonts/>
@@ -4706,7 +4706,7 @@
         </w:rPr>
         <w:t xml:space="preserve">Figure </w:t>
       </w:r>
-      <w:bookmarkStart w:id="bf705d46-bea4-4b07-a391-b77f23d23246" w:name="dv_vs_pred_ipred"/>
+      <w:bookmarkStart w:id="b1cbca9e-9c86-44cc-8775-fb60957c7ab9" w:name="dv_vs_pred_ipred"/>
       <w:r>
         <w:rPr/>
         <w:t xml:space="preserve"/>
@@ -4727,7 +4727,7 @@
         <w:rPr/>
         <w:t xml:space="preserve"/>
       </w:r>
-      <w:bookmarkEnd w:id="bf705d46-bea4-4b07-a391-b77f23d23246"/>
+      <w:bookmarkEnd w:id="b1cbca9e-9c86-44cc-8775-fb60957c7ab9"/>
       <w:r>
         <w:rPr>
           <w:rFonts/>
@@ -4815,7 +4815,7 @@
         </w:rPr>
         <w:t xml:space="preserve">Figure </w:t>
       </w:r>
-      <w:bookmarkStart w:id="732f25e3-f430-4879-8801-21e95f084ca6" w:name="prm_vs_iteration"/>
+      <w:bookmarkStart w:id="fd406b73-d952-46a9-9d58-ff53b024c53b" w:name="prm_vs_iteration"/>
       <w:r>
         <w:rPr/>
         <w:t xml:space="preserve"/>
@@ -4836,7 +4836,7 @@
         <w:rPr/>
         <w:t xml:space="preserve"/>
       </w:r>
-      <w:bookmarkEnd w:id="732f25e3-f430-4879-8801-21e95f084ca6"/>
+      <w:bookmarkEnd w:id="fd406b73-d952-46a9-9d58-ff53b024c53b"/>
       <w:r>
         <w:rPr>
           <w:rFonts/>

</xml_diff>

<commit_message>
Deploying to gh-pages from @ nlmixr2/nonmem2rx@ef533078856dbdf2f9accfbe131f46bfaee87c28 🚀
</commit_message>
<xml_diff>
--- a/articles/mod-Word.docx
+++ b/articles/mod-Word.docx
@@ -67,7 +67,7 @@
         </w:rPr>
         <w:t xml:space="preserve">Figure </w:t>
       </w:r>
-      <w:bookmarkStart w:id="af7947fd-a9b7-47fc-b49d-ed7bcbb055d1" w:name="model_diagram"/>
+      <w:bookmarkStart w:id="cf1cfbec-f747-44e0-9273-29b7cc04d2e4" w:name="model_diagram"/>
       <w:r>
         <w:rPr/>
         <w:t xml:space="preserve"/>
@@ -88,7 +88,7 @@
         <w:rPr/>
         <w:t xml:space="preserve"/>
       </w:r>
-      <w:bookmarkEnd w:id="af7947fd-a9b7-47fc-b49d-ed7bcbb055d1"/>
+      <w:bookmarkEnd w:id="cf1cfbec-f747-44e0-9273-29b7cc04d2e4"/>
       <w:r>
         <w:rPr>
           <w:rFonts/>
@@ -1266,7 +1266,7 @@
         </w:rPr>
         <w:t xml:space="preserve">Table </w:t>
       </w:r>
-      <w:bookmarkStart w:id="1d189f79-dbe2-4278-871e-63907c9b1d69" w:name="model_equations"/>
+      <w:bookmarkStart w:id="28cbae40-06c5-4784-8e71-3aa98f0b5981" w:name="model_equations"/>
       <w:r>
         <w:rPr/>
         <w:t xml:space="preserve"/>
@@ -1287,7 +1287,7 @@
         <w:rPr/>
         <w:t xml:space="preserve"/>
       </w:r>
-      <w:bookmarkEnd w:id="1d189f79-dbe2-4278-871e-63907c9b1d69"/>
+      <w:bookmarkEnd w:id="28cbae40-06c5-4784-8e71-3aa98f0b5981"/>
       <w:r>
         <w:rPr>
           <w:rFonts/>
@@ -3685,7 +3685,7 @@
         </w:rPr>
         <w:t xml:space="preserve">Table </w:t>
       </w:r>
-      <w:bookmarkStart w:id="1ac4a85a-03f0-47fb-9a4f-04f6766cc961" w:name="pest_table"/>
+      <w:bookmarkStart w:id="87c9643e-dbeb-4a64-921e-055b60641648" w:name="pest_table"/>
       <w:r>
         <w:rPr/>
         <w:t xml:space="preserve"/>
@@ -3706,7 +3706,7 @@
         <w:rPr/>
         <w:t xml:space="preserve"/>
       </w:r>
-      <w:bookmarkEnd w:id="1ac4a85a-03f0-47fb-9a4f-04f6766cc961"/>
+      <w:bookmarkEnd w:id="87c9643e-dbeb-4a64-921e-055b60641648"/>
       <w:r>
         <w:rPr>
           <w:rFonts/>
@@ -3802,7 +3802,7 @@
         </w:rPr>
         <w:t xml:space="preserve">Figure </w:t>
       </w:r>
-      <w:bookmarkStart w:id="e6d463d1-846f-482b-9a58-3a551fb42e82" w:name="ind_plots"/>
+      <w:bookmarkStart w:id="89310fae-3ecc-4930-bc0d-865fcb97241a" w:name="ind_plots"/>
       <w:r>
         <w:rPr/>
         <w:t xml:space="preserve"/>
@@ -3823,7 +3823,7 @@
         <w:rPr/>
         <w:t xml:space="preserve"/>
       </w:r>
-      <w:bookmarkEnd w:id="e6d463d1-846f-482b-9a58-3a551fb42e82"/>
+      <w:bookmarkEnd w:id="89310fae-3ecc-4930-bc0d-865fcb97241a"/>
       <w:r>
         <w:rPr>
           <w:rFonts/>
@@ -4706,7 +4706,7 @@
         </w:rPr>
         <w:t xml:space="preserve">Figure </w:t>
       </w:r>
-      <w:bookmarkStart w:id="b1cbca9e-9c86-44cc-8775-fb60957c7ab9" w:name="dv_vs_pred_ipred"/>
+      <w:bookmarkStart w:id="c05861f9-8478-4774-985a-ef452d5d647d" w:name="dv_vs_pred_ipred"/>
       <w:r>
         <w:rPr/>
         <w:t xml:space="preserve"/>
@@ -4727,7 +4727,7 @@
         <w:rPr/>
         <w:t xml:space="preserve"/>
       </w:r>
-      <w:bookmarkEnd w:id="b1cbca9e-9c86-44cc-8775-fb60957c7ab9"/>
+      <w:bookmarkEnd w:id="c05861f9-8478-4774-985a-ef452d5d647d"/>
       <w:r>
         <w:rPr>
           <w:rFonts/>
@@ -4815,7 +4815,7 @@
         </w:rPr>
         <w:t xml:space="preserve">Figure </w:t>
       </w:r>
-      <w:bookmarkStart w:id="fd406b73-d952-46a9-9d58-ff53b024c53b" w:name="prm_vs_iteration"/>
+      <w:bookmarkStart w:id="3f388957-2808-4418-a1ef-457fbd22a512" w:name="prm_vs_iteration"/>
       <w:r>
         <w:rPr/>
         <w:t xml:space="preserve"/>
@@ -4836,7 +4836,7 @@
         <w:rPr/>
         <w:t xml:space="preserve"/>
       </w:r>
-      <w:bookmarkEnd w:id="fd406b73-d952-46a9-9d58-ff53b024c53b"/>
+      <w:bookmarkEnd w:id="3f388957-2808-4418-a1ef-457fbd22a512"/>
       <w:r>
         <w:rPr>
           <w:rFonts/>

</xml_diff>